<commit_message>
Reflect the 25 Sep internal meeting: 動態表 v2_9 and post-meeting brief
</commit_message>
<xml_diff>
--- a/reports/acdr2026_staff_deployment/ACDR2026_所内打合せ資料_最新状況と要判断事項_0925.docx
+++ b/reports/acdr2026_staff_deployment/ACDR2026_所内打合せ資料_最新状況と要判断事項_0925.docx
@@ -13,7 +13,7 @@
           <w:color w:val="1F3864"/>
           <w:sz w:val="30"/>
         </w:rPr>
-        <w:t>ACDR2026 所内打合せ資料</w:t>
+        <w:t>ACDR2026 所内打合せ資料（9/25 打合せ後版）</w:t>
       </w:r>
     </w:p>
     <w:p>
@@ -27,7 +27,7 @@
           <w:color w:val="595959"/>
           <w:sz w:val="21"/>
         </w:rPr>
-        <w:t>最新状況と要判断事項（2026年9月25日 07:30 JST 時点）</w:t>
+        <w:t>打合せの決定事項と次のアクション（2026年9月25日 12:00 JST 時点）</w:t>
       </w:r>
     </w:p>
     <w:p>
@@ -41,7 +41,7 @@
           <w:color w:val="595959"/>
           <w:sz w:val="17"/>
         </w:rPr>
-        <w:t>作成: 荒木田　出典: メール（9/24 着信分まで）、WhatsApp（Coordination Team）、9/18 週次会議（Plaud）、COSEM 提供資料</w:t>
+        <w:t>作成: 荒木田　出典: 9/25 所内打合せ（Plaud 10:00-11:00、続く打合せ 11:02-11:11）、藤中の登録リスト（9/25）、メール・WhatsApp（9/24 まで）</w:t>
       </w:r>
     </w:p>
     <w:p>
@@ -68,7 +68,7 @@
           <w:i w:val="0"/>
           <w:sz w:val="19"/>
         </w:rPr>
-        <w:t>9/24 に三つ動いた。(1) テクニカルセッションの文書一式は池田と合意した（質疑15分＋まとめ10分、招待状 v2 に追加コメントなし、コンセプトノート rev 1.2）。残るのはシンガポール側の署名者だけで、署名後は池田が各登壇者へ発送する。(2) 会場は U 字28席案と機材リストを Sylvia 氏へ送付済み。名札・マイクの範囲、バナーの修正依頼も WhatsApp で回答済み。(3) ウズベキスタンと連絡が取れ、2名を選出・登録する予定と確認できた（事務局が案内メールを再送）。残る大物は、AV 費用の上限、Day 1 前倒し（日本パビリオンの所要時間次第）、内閣府枠（9/25）、招待状の COSEM 署名の4つ。</w:t>
+        <w:t>Day 1 の前倒しはラウンドテーブルの2分割で解決する（RT(1) 13:00-15:00、SC 15:15-16:15、RT(2) は29日 09:00-09:30）。3人目以降の参加者の費用は「2人目まで COSEM 負担、3人目以降は自己負担」の原則を守り、ADRC 職員分の割当をメンバー国・NZ に回す。いずれも 9/29 午前の COSEM 合同会議（日程変更）で提示する。本日 16:30 の内閣府連絡会では、出番の確認、民間2社、宿泊、日本パビリオンの所要時間を確認する。登録は 20か国36名（23か国見込み）、現地最大83名。Dorsett の増枠が急務。</w:t>
       </w:r>
     </w:p>
     <w:p>
@@ -85,7 +85,7 @@
           <w:color w:val="1F3864"/>
           <w:sz w:val="24"/>
         </w:rPr>
-        <w:t>1. 直近の期限</w:t>
+        <w:t>1. 9/25 所内打合せで決まったこと</w:t>
       </w:r>
     </w:p>
     <w:tbl>
@@ -97,14 +97,14 @@
         <w:tblLook w:firstColumn="1" w:firstRow="1" w:lastColumn="0" w:lastRow="0" w:noHBand="0" w:noVBand="1" w:val="04A0"/>
       </w:tblPr>
       <w:tblGrid>
-        <w:gridCol w:w="1701"/>
-        <w:gridCol w:w="4082"/>
-        <w:gridCol w:w="4082"/>
+        <w:gridCol w:w="1474"/>
+        <w:gridCol w:w="6803"/>
+        <w:gridCol w:w="1587"/>
       </w:tblGrid>
       <w:tr>
         <w:tc>
           <w:tcPr>
-            <w:tcW w:type="dxa" w:w="1701"/>
+            <w:tcW w:type="dxa" w:w="1474"/>
             <w:shd w:val="clear" w:color="auto" w:fill="1F3864"/>
           </w:tcPr>
           <w:p>
@@ -118,13 +118,13 @@
                 <w:color w:val="FFFFFF"/>
                 <w:sz w:val="17"/>
               </w:rPr>
-              <w:t>日付</w:t>
+              <w:t>項目</w:t>
             </w:r>
           </w:p>
         </w:tc>
         <w:tc>
           <w:tcPr>
-            <w:tcW w:type="dxa" w:w="4082"/>
+            <w:tcW w:type="dxa" w:w="6803"/>
             <w:shd w:val="clear" w:color="auto" w:fill="1F3864"/>
           </w:tcPr>
           <w:p>
@@ -138,13 +138,13 @@
                 <w:color w:val="FFFFFF"/>
                 <w:sz w:val="17"/>
               </w:rPr>
-              <w:t>事項</w:t>
+              <w:t>決定・方針</w:t>
             </w:r>
           </w:p>
         </w:tc>
         <w:tc>
           <w:tcPr>
-            <w:tcW w:type="dxa" w:w="4082"/>
+            <w:tcW w:type="dxa" w:w="1587"/>
             <w:shd w:val="clear" w:color="auto" w:fill="1F3864"/>
           </w:tcPr>
           <w:p>
@@ -158,7 +158,7 @@
                 <w:color w:val="FFFFFF"/>
                 <w:sz w:val="17"/>
               </w:rPr>
-              <w:t>備考</w:t>
+              <w:t>担当</w:t>
             </w:r>
           </w:p>
         </w:tc>
@@ -166,7 +166,7 @@
       <w:tr>
         <w:tc>
           <w:tcPr>
-            <w:tcW w:type="dxa" w:w="1701"/>
+            <w:tcW w:type="dxa" w:w="1474"/>
           </w:tcPr>
           <w:p>
             <w:pPr>
@@ -178,13 +178,13 @@
                 <w:b w:val="0"/>
                 <w:sz w:val="17"/>
               </w:rPr>
-              <w:t>9/25（金）15:30</w:t>
+              <w:t>Day 1 前倒し</w:t>
             </w:r>
           </w:p>
         </w:tc>
         <w:tc>
           <w:tcPr>
-            <w:tcW w:type="dxa" w:w="4082"/>
+            <w:tcW w:type="dxa" w:w="6803"/>
           </w:tcPr>
           <w:p>
             <w:pPr>
@@ -196,13 +196,13 @@
                 <w:b w:val="0"/>
                 <w:sz w:val="17"/>
               </w:rPr>
-              <w:t>内閣府 定期連絡会</w:t>
+              <w:t>RT・SC は短縮しない。RT を2分割し、RT(1) 28日 13:00-15:00、SC 15:15-16:15（30分前倒し）、RT(2) 29日 09:00-09:30、TS 09:30-11:30 は据え置き。Gala 出発 17:30 まで75分を確保。日本側（Zoom）は29日 JST 10:00 開始。</w:t>
             </w:r>
           </w:p>
         </w:tc>
         <w:tc>
           <w:tcPr>
-            <w:tcW w:type="dxa" w:w="4082"/>
+            <w:tcW w:type="dxa" w:w="1587"/>
           </w:tcPr>
           <w:p>
             <w:pPr>
@@ -214,7 +214,7 @@
                 <w:b w:val="0"/>
                 <w:sz w:val="17"/>
               </w:rPr>
-              <w:t>CaO 登壇枠の依頼、日本パビリオン開会式の所要時間（Day 1 前倒しの前提）、SJ60 レセプションの GOH/長官の扱い</w:t>
+              <w:t>荒木田 → COSEM・内閣府</w:t>
             </w:r>
           </w:p>
         </w:tc>
@@ -222,7 +222,7 @@
       <w:tr>
         <w:tc>
           <w:tcPr>
-            <w:tcW w:type="dxa" w:w="1701"/>
+            <w:tcW w:type="dxa" w:w="1474"/>
           </w:tcPr>
           <w:p>
             <w:pPr>
@@ -234,13 +234,13 @@
                 <w:b w:val="0"/>
                 <w:sz w:val="17"/>
               </w:rPr>
-              <w:t>9/25（金）</w:t>
+              <w:t>日本パビリオン</w:t>
             </w:r>
           </w:p>
         </w:tc>
         <w:tc>
           <w:tcPr>
-            <w:tcW w:type="dxa" w:w="4082"/>
+            <w:tcW w:type="dxa" w:w="6803"/>
           </w:tcPr>
           <w:p>
             <w:pPr>
@@ -252,13 +252,13 @@
                 <w:b w:val="0"/>
                 <w:sz w:val="17"/>
               </w:rPr>
-              <w:t>ビザ書類（Form 14A・写真）返送期限</w:t>
+              <w:t>開会式ではなく、VIP ツアー立寄り時に展示を紹介する挨拶。ADRC 参加者の EXPO 見学は VIP ツアーに合わせて短縮する。</w:t>
             </w:r>
           </w:p>
         </w:tc>
         <w:tc>
           <w:tcPr>
-            <w:tcW w:type="dxa" w:w="4082"/>
+            <w:tcW w:type="dxa" w:w="1587"/>
           </w:tcPr>
           <w:p>
             <w:pPr>
@@ -270,7 +270,7 @@
                 <w:b w:val="0"/>
                 <w:sz w:val="17"/>
               </w:rPr>
-              <w:t>対象: インド3（Official なら不要）、パキスタン2</w:t>
+              <w:t>児玉・荒木田</w:t>
             </w:r>
           </w:p>
         </w:tc>
@@ -278,7 +278,7 @@
       <w:tr>
         <w:tc>
           <w:tcPr>
-            <w:tcW w:type="dxa" w:w="1701"/>
+            <w:tcW w:type="dxa" w:w="1474"/>
           </w:tcPr>
           <w:p>
             <w:pPr>
@@ -290,13 +290,13 @@
                 <w:b w:val="0"/>
                 <w:sz w:val="17"/>
               </w:rPr>
-              <w:t>9/25（金）午前</w:t>
+              <w:t>座席</w:t>
             </w:r>
           </w:p>
         </w:tc>
         <w:tc>
           <w:tcPr>
-            <w:tcW w:type="dxa" w:w="4082"/>
+            <w:tcW w:type="dxa" w:w="6803"/>
           </w:tcPr>
           <w:p>
             <w:pPr>
@@ -308,13 +308,13 @@
                 <w:b w:val="0"/>
                 <w:sz w:val="17"/>
               </w:rPr>
-              <w:t>SC 用 ADRC 活動報告案の確認締切</w:t>
+              <w:t>U 字28 = 最大23か国＋SG1＋日本1＋ADRC1（余裕があれば NZ1・ADPC1、入らなければ2列目）。サイド列は2人目以降。後方はリソース、招待組織（AHA センター、ASEAN 事務局、西川専門員）、ADRC 職員。事務局席は前方寄り（ADRC 席の後方）に再配置。SC の前方席は ADRC（所長が説明）と内閣府。藤中は席不要。北本の紹介・着席位置に配慮。実スケール確認後に電源・マイクを確定。</w:t>
             </w:r>
           </w:p>
         </w:tc>
         <w:tc>
           <w:tcPr>
-            <w:tcW w:type="dxa" w:w="4082"/>
+            <w:tcW w:type="dxa" w:w="1587"/>
           </w:tcPr>
           <w:p>
             <w:pPr>
@@ -326,7 +326,7 @@
                 <w:b w:val="0"/>
                 <w:sz w:val="17"/>
               </w:rPr>
-              <w:t>池田・Mizan・荒木田・Gerry・中村・立部の修正は反映済み。児玉が取りまとめ中</w:t>
+              <w:t>荒木田</w:t>
             </w:r>
           </w:p>
         </w:tc>
@@ -334,7 +334,7 @@
       <w:tr>
         <w:tc>
           <w:tcPr>
-            <w:tcW w:type="dxa" w:w="1701"/>
+            <w:tcW w:type="dxa" w:w="1474"/>
           </w:tcPr>
           <w:p>
             <w:pPr>
@@ -346,13 +346,13 @@
                 <w:b w:val="0"/>
                 <w:sz w:val="17"/>
               </w:rPr>
-              <w:t>9/26（土）</w:t>
+              <w:t>バナー</w:t>
             </w:r>
           </w:p>
         </w:tc>
         <w:tc>
           <w:tcPr>
-            <w:tcW w:type="dxa" w:w="4082"/>
+            <w:tcW w:type="dxa" w:w="6803"/>
           </w:tcPr>
           <w:p>
             <w:pPr>
@@ -364,13 +364,13 @@
                 <w:b w:val="0"/>
                 <w:sz w:val="17"/>
               </w:rPr>
-              <w:t>シンガポール入国ビザ 申請受付開始（到着30日前）</w:t>
+              <w:t>COSEM/SCDF 案で固まりつつある。期間表記は「27-30 October 2026」（ACDR2026 全体）に訂正を申入れ。会場名 Singapore Expo は維持。内閣府の確認（本日）後に確定。</w:t>
             </w:r>
           </w:p>
         </w:tc>
         <w:tc>
           <w:tcPr>
-            <w:tcW w:type="dxa" w:w="4082"/>
+            <w:tcW w:type="dxa" w:w="1587"/>
           </w:tcPr>
           <w:p>
             <w:pPr>
@@ -382,7 +382,7 @@
                 <w:b w:val="0"/>
                 <w:sz w:val="17"/>
               </w:rPr>
-              <w:t>COSEM が Corppass で一括提出。発行まで3営業日</w:t>
+              <w:t>荒木田</w:t>
             </w:r>
           </w:p>
         </w:tc>
@@ -390,7 +390,7 @@
       <w:tr>
         <w:tc>
           <w:tcPr>
-            <w:tcW w:type="dxa" w:w="1701"/>
+            <w:tcW w:type="dxa" w:w="1474"/>
           </w:tcPr>
           <w:p>
             <w:pPr>
@@ -402,13 +402,13 @@
                 <w:b w:val="0"/>
                 <w:sz w:val="17"/>
               </w:rPr>
-              <w:t>9/27（日）</w:t>
+              <w:t>3人目以降の費用</w:t>
             </w:r>
           </w:p>
         </w:tc>
         <w:tc>
           <w:tcPr>
-            <w:tcW w:type="dxa" w:w="4082"/>
+            <w:tcW w:type="dxa" w:w="6803"/>
           </w:tcPr>
           <w:p>
             <w:pPr>
@@ -420,13 +420,13 @@
                 <w:b w:val="0"/>
                 <w:sz w:val="17"/>
               </w:rPr>
-              <w:t>池田 出発（〜10/7）</w:t>
+              <w:t>2人目まで（メンバー国・リソース）は COSEM 負担でランチ・Gala 可。3人目以降は自己負担が原則。ADRC 職員分の割当をメンバー国・NZ に回す（Gala は可、ランチは Sylvia 氏が確認中）。不可ならメンバー国・アドバイザー国の3人目以降はランチと3日目パスを自己負担。ADPC の追加2名は ADRC 負担なし。ただし GI でランチ付きと案内した経緯があるので言い方に配慮。余裕があるからと安易に広げず原則を守る（宮木）。</w:t>
             </w:r>
           </w:p>
         </w:tc>
         <w:tc>
           <w:tcPr>
-            <w:tcW w:type="dxa" w:w="4082"/>
+            <w:tcW w:type="dxa" w:w="1587"/>
           </w:tcPr>
           <w:p>
             <w:pPr>
@@ -438,7 +438,7 @@
                 <w:b w:val="0"/>
                 <w:sz w:val="17"/>
               </w:rPr>
-              <w:t>招待状・CN は確認済み。出発前に残るのは SG 側署名者の確認のみ</w:t>
+              <w:t>藤中 → 9/29 合同会議</w:t>
             </w:r>
           </w:p>
         </w:tc>
@@ -446,7 +446,7 @@
       <w:tr>
         <w:tc>
           <w:tcPr>
-            <w:tcW w:type="dxa" w:w="1701"/>
+            <w:tcW w:type="dxa" w:w="1474"/>
           </w:tcPr>
           <w:p>
             <w:pPr>
@@ -458,13 +458,13 @@
                 <w:b w:val="0"/>
                 <w:sz w:val="17"/>
               </w:rPr>
-              <w:t>9/27 頃</w:t>
+              <w:t>Dorsett</w:t>
             </w:r>
           </w:p>
         </w:tc>
         <w:tc>
           <w:tcPr>
-            <w:tcW w:type="dxa" w:w="4082"/>
+            <w:tcW w:type="dxa" w:w="6803"/>
           </w:tcPr>
           <w:p>
             <w:pPr>
@@ -476,13 +476,13 @@
                 <w:b w:val="0"/>
                 <w:sz w:val="17"/>
               </w:rPr>
-              <w:t>SJ60 レセプション名簿の提出（1か月前）</w:t>
+              <w:t>確保37室に対し2人目・3人目の希望が増えている。早期に増枠を申入れる。確保できなければ「できない」と明確に伝える。</w:t>
             </w:r>
           </w:p>
         </w:tc>
         <w:tc>
           <w:tcPr>
-            <w:tcW w:type="dxa" w:w="4082"/>
+            <w:tcW w:type="dxa" w:w="1587"/>
           </w:tcPr>
           <w:p>
             <w:pPr>
@@ -494,7 +494,7 @@
                 <w:b w:val="0"/>
                 <w:sz w:val="17"/>
               </w:rPr>
-              <w:t>招待状は大使館が全参加者へ</w:t>
+              <w:t>藤中</w:t>
             </w:r>
           </w:p>
         </w:tc>
@@ -502,7 +502,7 @@
       <w:tr>
         <w:tc>
           <w:tcPr>
-            <w:tcW w:type="dxa" w:w="1701"/>
+            <w:tcW w:type="dxa" w:w="1474"/>
           </w:tcPr>
           <w:p>
             <w:pPr>
@@ -514,13 +514,13 @@
                 <w:b w:val="0"/>
                 <w:sz w:val="17"/>
               </w:rPr>
-              <w:t>〜10/4</w:t>
+              <w:t>大使表敬</w:t>
             </w:r>
           </w:p>
         </w:tc>
         <w:tc>
           <w:tcPr>
-            <w:tcW w:type="dxa" w:w="4082"/>
+            <w:tcW w:type="dxa" w:w="6803"/>
           </w:tcPr>
           <w:p>
             <w:pPr>
@@ -532,13 +532,13 @@
                 <w:b w:val="0"/>
                 <w:sz w:val="17"/>
               </w:rPr>
-              <w:t>Mizan 出張中（Ho Chi Minh → Jakarta）</w:t>
+              <w:t>役員（三浦・北本・宮木中心）が27日午前に会場を短時間見た後、大使館へ表敬。26日は長官夕食会のため不可。大使館の足立氏と時間調整。</w:t>
             </w:r>
           </w:p>
         </w:tc>
         <w:tc>
           <w:tcPr>
-            <w:tcW w:type="dxa" w:w="4082"/>
+            <w:tcW w:type="dxa" w:w="1587"/>
           </w:tcPr>
           <w:p>
             <w:pPr>
@@ -550,7 +550,7 @@
                 <w:b w:val="0"/>
                 <w:sz w:val="17"/>
               </w:rPr>
-              <w:t>メールは通じる。BRIN・ネパールの連絡窓口</w:t>
+              <w:t>荒木田</w:t>
             </w:r>
           </w:p>
         </w:tc>
@@ -558,7 +558,7 @@
       <w:tr>
         <w:tc>
           <w:tcPr>
-            <w:tcW w:type="dxa" w:w="1701"/>
+            <w:tcW w:type="dxa" w:w="1474"/>
           </w:tcPr>
           <w:p>
             <w:pPr>
@@ -570,13 +570,13 @@
                 <w:b w:val="0"/>
                 <w:sz w:val="17"/>
               </w:rPr>
-              <w:t>9/29（火）</w:t>
+              <w:t>会場設営</w:t>
             </w:r>
           </w:p>
         </w:tc>
         <w:tc>
           <w:tcPr>
-            <w:tcW w:type="dxa" w:w="4082"/>
+            <w:tcW w:type="dxa" w:w="6803"/>
           </w:tcPr>
           <w:p>
             <w:pPr>
@@ -588,13 +588,13 @@
                 <w:b w:val="0"/>
                 <w:sz w:val="17"/>
               </w:rPr>
-              <w:t>SCDF モデレーターとのオンラインブリーフィング 第一候補</w:t>
+              <w:t>当日朝の設営・テストは可。前日（27日）に入れる時刻は未確認。前日設営が可能なら、一部が公邸レセプションを外れて設営に残る。</w:t>
             </w:r>
           </w:p>
         </w:tc>
         <w:tc>
           <w:tcPr>
-            <w:tcW w:type="dxa" w:w="4082"/>
+            <w:tcW w:type="dxa" w:w="1587"/>
           </w:tcPr>
           <w:p>
             <w:pPr>
@@ -606,7 +606,7 @@
                 <w:b w:val="0"/>
                 <w:sz w:val="17"/>
               </w:rPr>
-              <w:t>代替 9/30、10/8、10/9。Mizan が Sylvia 氏と設定</w:t>
+              <w:t>荒木田 → Sylvia</w:t>
             </w:r>
           </w:p>
         </w:tc>
@@ -614,7 +614,7 @@
       <w:tr>
         <w:tc>
           <w:tcPr>
-            <w:tcW w:type="dxa" w:w="1701"/>
+            <w:tcW w:type="dxa" w:w="1474"/>
           </w:tcPr>
           <w:p>
             <w:pPr>
@@ -626,13 +626,13 @@
                 <w:b w:val="0"/>
                 <w:sz w:val="17"/>
               </w:rPr>
-              <w:t>9月末</w:t>
+              <w:t>サマリー</w:t>
             </w:r>
           </w:p>
         </w:tc>
         <w:tc>
           <w:tcPr>
-            <w:tcW w:type="dxa" w:w="4082"/>
+            <w:tcW w:type="dxa" w:w="6803"/>
           </w:tcPr>
           <w:p>
             <w:pPr>
@@ -644,13 +644,13 @@
                 <w:b w:val="0"/>
                 <w:sz w:val="17"/>
               </w:rPr>
-              <w:t>GI 改訂</w:t>
+              <w:t>29日 11:30 のサマリーに向け、TS は発表原稿から事前に概要案を作り Gerry へ（池田・Mizan）。RT は当日の発表を聞きながら作成（RT 担当）。</w:t>
             </w:r>
           </w:p>
         </w:tc>
         <w:tc>
           <w:tcPr>
-            <w:tcW w:type="dxa" w:w="4082"/>
+            <w:tcW w:type="dxa" w:w="1587"/>
           </w:tcPr>
           <w:p>
             <w:pPr>
@@ -662,7 +662,7 @@
                 <w:b w:val="0"/>
                 <w:sz w:val="17"/>
               </w:rPr>
-              <w:t>担当 藤中。フィールドトリップ 13:00 出発・服装、SIDEX 展示の靴、ドレスコード</w:t>
+              <w:t>池田・Mizan・Gerry</w:t>
             </w:r>
           </w:p>
         </w:tc>
@@ -670,7 +670,7 @@
       <w:tr>
         <w:tc>
           <w:tcPr>
-            <w:tcW w:type="dxa" w:w="1701"/>
+            <w:tcW w:type="dxa" w:w="1474"/>
           </w:tcPr>
           <w:p>
             <w:pPr>
@@ -682,13 +682,13 @@
                 <w:b w:val="0"/>
                 <w:sz w:val="17"/>
               </w:rPr>
-              <w:t>10/1（木）15:00</w:t>
+              <w:t>合同会議</w:t>
             </w:r>
           </w:p>
         </w:tc>
         <w:tc>
           <w:tcPr>
-            <w:tcW w:type="dxa" w:w="4082"/>
+            <w:tcW w:type="dxa" w:w="6803"/>
           </w:tcPr>
           <w:p>
             <w:pPr>
@@ -700,13 +700,13 @@
                 <w:b w:val="0"/>
                 <w:sz w:val="17"/>
               </w:rPr>
-              <w:t>第6回 COSEM-ADRC 合同会議</w:t>
+              <w:t>Sylvia 氏の変更申入れにより、第6回合同会議を 10/1 15:00 から 9/29 午前へ（児玉可）。</w:t>
             </w:r>
           </w:p>
         </w:tc>
         <w:tc>
           <w:tcPr>
-            <w:tcW w:type="dxa" w:w="4082"/>
+            <w:tcW w:type="dxa" w:w="1587"/>
           </w:tcPr>
           <w:p>
             <w:pPr>
@@ -718,7 +718,7 @@
                 <w:b w:val="0"/>
                 <w:sz w:val="17"/>
               </w:rPr>
-              <w:t>座席案・AV 見積・Day 1・バナー・07:30 入室・ビザ・名簿。第7回 10/15 が最終</w:t>
+              <w:t>荒木田</w:t>
             </w:r>
           </w:p>
         </w:tc>
@@ -726,7 +726,7 @@
       <w:tr>
         <w:tc>
           <w:tcPr>
-            <w:tcW w:type="dxa" w:w="1701"/>
+            <w:tcW w:type="dxa" w:w="1474"/>
           </w:tcPr>
           <w:p>
             <w:pPr>
@@ -738,13 +738,13 @@
                 <w:b w:val="0"/>
                 <w:sz w:val="17"/>
               </w:rPr>
-              <w:t>10/2（金）</w:t>
+              <w:t>期限</w:t>
             </w:r>
           </w:p>
         </w:tc>
         <w:tc>
           <w:tcPr>
-            <w:tcW w:type="dxa" w:w="4082"/>
+            <w:tcW w:type="dxa" w:w="6803"/>
           </w:tcPr>
           <w:p>
             <w:pPr>
@@ -756,13 +756,13 @@
                 <w:b w:val="0"/>
                 <w:sz w:val="17"/>
               </w:rPr>
-              <w:t>TS 登壇者: タイトル・アブストラクト・略歴・写真</w:t>
+              <w:t>10/9 に全事項を確定、10/13 に Final Announcement。プレスリリース用資料を作成。GI は状況に応じて随時改定。</w:t>
             </w:r>
           </w:p>
         </w:tc>
         <w:tc>
           <w:tcPr>
-            <w:tcW w:type="dxa" w:w="4082"/>
+            <w:tcW w:type="dxa" w:w="1587"/>
           </w:tcPr>
           <w:p>
             <w:pPr>
@@ -774,7 +774,7 @@
                 <w:b w:val="0"/>
                 <w:sz w:val="17"/>
               </w:rPr>
-              <w:t>ウズベキスタンは未定のまま。JAXA は人選中</w:t>
+              <w:t>荒木田・藤中</w:t>
             </w:r>
           </w:p>
         </w:tc>
@@ -782,7 +782,7 @@
       <w:tr>
         <w:tc>
           <w:tcPr>
-            <w:tcW w:type="dxa" w:w="1701"/>
+            <w:tcW w:type="dxa" w:w="1474"/>
           </w:tcPr>
           <w:p>
             <w:pPr>
@@ -794,13 +794,13 @@
                 <w:b w:val="0"/>
                 <w:sz w:val="17"/>
               </w:rPr>
-              <w:t>10/20（火）</w:t>
+              <w:t>ウズベキスタン</w:t>
             </w:r>
           </w:p>
         </w:tc>
         <w:tc>
           <w:tcPr>
-            <w:tcW w:type="dxa" w:w="4082"/>
+            <w:tcW w:type="dxa" w:w="6803"/>
           </w:tcPr>
           <w:p>
             <w:pPr>
@@ -812,13 +812,13 @@
                 <w:b w:val="0"/>
                 <w:sz w:val="17"/>
               </w:rPr>
-              <w:t>TS スライド（16:9）</w:t>
+              <w:t>2名 = 登壇者1名＋一般1名。事務局が案内メールを再送済み。</w:t>
             </w:r>
           </w:p>
         </w:tc>
         <w:tc>
           <w:tcPr>
-            <w:tcW w:type="dxa" w:w="4082"/>
+            <w:tcW w:type="dxa" w:w="1587"/>
           </w:tcPr>
           <w:p>
             <w:pPr>
@@ -830,6 +830,7 @@
                 <w:b w:val="0"/>
                 <w:sz w:val="17"/>
               </w:rPr>
+              <w:t>荒木田・田中</w:t>
             </w:r>
           </w:p>
         </w:tc>
@@ -837,7 +838,7 @@
       <w:tr>
         <w:tc>
           <w:tcPr>
-            <w:tcW w:type="dxa" w:w="1701"/>
+            <w:tcW w:type="dxa" w:w="1474"/>
           </w:tcPr>
           <w:p>
             <w:pPr>
@@ -849,13 +850,13 @@
                 <w:b w:val="0"/>
                 <w:sz w:val="17"/>
               </w:rPr>
-              <w:t>10/27（火）</w:t>
+              <w:t>インドネシア</w:t>
             </w:r>
           </w:p>
         </w:tc>
         <w:tc>
           <w:tcPr>
-            <w:tcW w:type="dxa" w:w="4082"/>
+            <w:tcW w:type="dxa" w:w="6803"/>
           </w:tcPr>
           <w:p>
             <w:pPr>
@@ -867,13 +868,13 @@
                 <w:b w:val="0"/>
                 <w:sz w:val="17"/>
               </w:rPr>
-              <w:t>SJ60 記念レセプション（大使公邸）</w:t>
+              <w:t>環境省の登録者は一般扱い。BNPB は過去の連絡先へ1回確認し、返答がなければ支援対象外。</w:t>
             </w:r>
           </w:p>
         </w:tc>
         <w:tc>
           <w:tcPr>
-            <w:tcW w:type="dxa" w:w="4082"/>
+            <w:tcW w:type="dxa" w:w="1587"/>
           </w:tcPr>
           <w:p>
             <w:pPr>
@@ -885,6 +886,63 @@
                 <w:b w:val="0"/>
                 <w:sz w:val="17"/>
               </w:rPr>
+              <w:t>荒木田</w:t>
+            </w:r>
+          </w:p>
+        </w:tc>
+      </w:tr>
+      <w:tr>
+        <w:tc>
+          <w:tcPr>
+            <w:tcW w:type="dxa" w:w="1474"/>
+          </w:tcPr>
+          <w:p>
+            <w:pPr>
+              <w:spacing w:after="0" w:line="240" w:lineRule="auto"/>
+            </w:pPr>
+            <w:r/>
+            <w:r>
+              <w:rPr>
+                <w:b w:val="0"/>
+                <w:sz w:val="17"/>
+              </w:rPr>
+              <w:t>AV 費用（続く打合せ）</w:t>
+            </w:r>
+          </w:p>
+        </w:tc>
+        <w:tc>
+          <w:tcPr>
+            <w:tcW w:type="dxa" w:w="6803"/>
+          </w:tcPr>
+          <w:p>
+            <w:pPr>
+              <w:spacing w:after="0" w:line="240" w:lineRule="auto"/>
+            </w:pPr>
+            <w:r/>
+            <w:r>
+              <w:rPr>
+                <w:b w:val="0"/>
+                <w:sz w:val="17"/>
+              </w:rPr>
+              <w:t>上限額は費用が判明するまで提示しない。削減案として卓上マイク全席を見送り、移動用＋モデレーター用2本程度に絞る案（9/24 に送った機材リストとの整合を要再検討）。支払は現地での現金持込を避け、COSEM への一括払いかホテル精算への合算を確認。</w:t>
+            </w:r>
+          </w:p>
+        </w:tc>
+        <w:tc>
+          <w:tcPr>
+            <w:tcW w:type="dxa" w:w="1587"/>
+          </w:tcPr>
+          <w:p>
+            <w:pPr>
+              <w:spacing w:after="0" w:line="240" w:lineRule="auto"/>
+            </w:pPr>
+            <w:r/>
+            <w:r>
+              <w:rPr>
+                <w:b w:val="0"/>
+                <w:sz w:val="17"/>
+              </w:rPr>
+              <w:t>荒木田</w:t>
             </w:r>
           </w:p>
         </w:tc>
@@ -909,7 +967,7 @@
           <w:color w:val="1F3864"/>
           <w:sz w:val="24"/>
         </w:rPr>
-        <w:t>2. 9/17 以降に決まったこと（9/24 午前の更新を含む）</w:t>
+        <w:t>2. 登録状況（藤中の登録リスト 9/25）</w:t>
       </w:r>
     </w:p>
     <w:tbl>
@@ -921,14 +979,14 @@
         <w:tblLook w:firstColumn="1" w:firstRow="1" w:lastColumn="0" w:lastRow="0" w:noHBand="0" w:noVBand="1" w:val="04A0"/>
       </w:tblPr>
       <w:tblGrid>
-        <w:gridCol w:w="1361"/>
-        <w:gridCol w:w="6236"/>
-        <w:gridCol w:w="2268"/>
+        <w:gridCol w:w="1474"/>
+        <w:gridCol w:w="1928"/>
+        <w:gridCol w:w="6463"/>
       </w:tblGrid>
       <w:tr>
         <w:tc>
           <w:tcPr>
-            <w:tcW w:type="dxa" w:w="1361"/>
+            <w:tcW w:type="dxa" w:w="1474"/>
             <w:shd w:val="clear" w:color="auto" w:fill="1F3864"/>
           </w:tcPr>
           <w:p>
@@ -942,13 +1000,13 @@
                 <w:color w:val="FFFFFF"/>
                 <w:sz w:val="17"/>
               </w:rPr>
-              <w:t>分野</w:t>
+              <w:t>区分</w:t>
             </w:r>
           </w:p>
         </w:tc>
         <w:tc>
           <w:tcPr>
-            <w:tcW w:type="dxa" w:w="6236"/>
+            <w:tcW w:type="dxa" w:w="1928"/>
             <w:shd w:val="clear" w:color="auto" w:fill="1F3864"/>
           </w:tcPr>
           <w:p>
@@ -962,13 +1020,13 @@
                 <w:color w:val="FFFFFF"/>
                 <w:sz w:val="17"/>
               </w:rPr>
-              <w:t>内容</w:t>
+              <w:t>人数</w:t>
             </w:r>
           </w:p>
         </w:tc>
         <w:tc>
           <w:tcPr>
-            <w:tcW w:type="dxa" w:w="2268"/>
+            <w:tcW w:type="dxa" w:w="6463"/>
             <w:shd w:val="clear" w:color="auto" w:fill="1F3864"/>
           </w:tcPr>
           <w:p>
@@ -982,7 +1040,7 @@
                 <w:color w:val="FFFFFF"/>
                 <w:sz w:val="17"/>
               </w:rPr>
-              <w:t>出典</w:t>
+              <w:t>備考</w:t>
             </w:r>
           </w:p>
         </w:tc>
@@ -990,7 +1048,7 @@
       <w:tr>
         <w:tc>
           <w:tcPr>
-            <w:tcW w:type="dxa" w:w="1361"/>
+            <w:tcW w:type="dxa" w:w="1474"/>
           </w:tcPr>
           <w:p>
             <w:pPr>
@@ -1002,13 +1060,13 @@
                 <w:b w:val="0"/>
                 <w:sz w:val="17"/>
               </w:rPr>
-              <w:t>TS 文書一式（新）</w:t>
+              <w:t>メンバー国</w:t>
             </w:r>
           </w:p>
         </w:tc>
         <w:tc>
           <w:tcPr>
-            <w:tcW w:type="dxa" w:w="6236"/>
+            <w:tcW w:type="dxa" w:w="1928"/>
           </w:tcPr>
           <w:p>
             <w:pPr>
@@ -1020,13 +1078,13 @@
                 <w:b w:val="0"/>
                 <w:sz w:val="17"/>
               </w:rPr>
-              <w:t>質疑15分＋まとめ10分（rev 1.0）を採用。当日の状況で「Q&amp;A とまとめ」の配分は調整可。Sirada 氏へは荒木田から一行訂正。招待状 v2 は池田から追加コメントなし。SG 側署名が済み次第、池田が各登壇者へ発送。コンセプトノートは「Central Asia and Caucasus countries」の表現で rev 1.2（所内版・対外版）。途中版を JAXA・BRIN・YI-Lab へ先に共有してよい。登壇確定者から登録と藤本への連絡を依頼。</w:t>
+              <w:t>20か国 36名</w:t>
             </w:r>
           </w:p>
         </w:tc>
         <w:tc>
           <w:tcPr>
-            <w:tcW w:type="dxa" w:w="2268"/>
+            <w:tcW w:type="dxa" w:w="6463"/>
           </w:tcPr>
           <w:p>
             <w:pPr>
@@ -1038,7 +1096,7 @@
                 <w:b w:val="0"/>
                 <w:sz w:val="17"/>
               </w:rPr>
-              <w:t>池田 9/24 10:00、荒木田 9/24 10:34</w:t>
+              <w:t>アルメニア、アゼルバイジャン2、バングラデシュ、ブータン、ブルネイ（＋1の可能性）、カンボジア、フィジー、インド3、ラオス、マレーシア、モルディブ、モンゴル、ミャンマー、パキスタン2、PNG2、韓国4、シンガポール5、スリランカ、トルコ3、ベトナム3。日本・タイ・ウズベキスタンが加わると23か国</w:t>
             </w:r>
           </w:p>
         </w:tc>
@@ -1046,7 +1104,7 @@
       <w:tr>
         <w:tc>
           <w:tcPr>
-            <w:tcW w:type="dxa" w:w="1361"/>
+            <w:tcW w:type="dxa" w:w="1474"/>
           </w:tcPr>
           <w:p>
             <w:pPr>
@@ -1058,13 +1116,13 @@
                 <w:b w:val="0"/>
                 <w:sz w:val="17"/>
               </w:rPr>
-              <w:t>会場（新）</w:t>
+              <w:t>アドバイザー国</w:t>
             </w:r>
           </w:p>
         </w:tc>
         <w:tc>
           <w:tcPr>
-            <w:tcW w:type="dxa" w:w="6236"/>
+            <w:tcW w:type="dxa" w:w="1928"/>
           </w:tcPr>
           <w:p>
             <w:pPr>
@@ -1076,13 +1134,13 @@
                 <w:b w:val="0"/>
                 <w:sz w:val="17"/>
               </w:rPr>
-              <w:t>Peridot 201-203 確定（28日終日＋29日午前）。9/24 に Sylvia 氏へ送付: U 字28席（12+4+12、メンバー国22＋ホスト6、全席名札・卓上マイク2席に1本）、両サイド12席×2列（机あり）、教室型8席×4列、後方シアター席。前方エリアのみセッションごとに変更（開会・閉会=演壇、RT/SC=モデレーター卓、TS=共同議長卓＋登壇者卓6）。EXPO に作図を依頼。</w:t>
+              <w:t>NZ 3名</w:t>
             </w:r>
           </w:p>
         </w:tc>
         <w:tc>
           <w:tcPr>
-            <w:tcW w:type="dxa" w:w="2268"/>
+            <w:tcW w:type="dxa" w:w="6463"/>
           </w:tcPr>
           <w:p>
             <w:pPr>
@@ -1094,7 +1152,7 @@
                 <w:b w:val="0"/>
                 <w:sz w:val="17"/>
               </w:rPr>
-              <w:t>荒木田→Sylvia 9/24 09:43 メール</w:t>
+              <w:t>Gawn 氏、Michie 氏、Meiklejohn 氏</w:t>
             </w:r>
           </w:p>
         </w:tc>
@@ -1102,7 +1160,7 @@
       <w:tr>
         <w:tc>
           <w:tcPr>
-            <w:tcW w:type="dxa" w:w="1361"/>
+            <w:tcW w:type="dxa" w:w="1474"/>
           </w:tcPr>
           <w:p>
             <w:pPr>
@@ -1114,13 +1172,13 @@
                 <w:b w:val="0"/>
                 <w:sz w:val="17"/>
               </w:rPr>
-              <w:t>名札・マイク（新）</w:t>
+              <w:t>一般</w:t>
             </w:r>
           </w:p>
         </w:tc>
         <w:tc>
           <w:tcPr>
-            <w:tcW w:type="dxa" w:w="6236"/>
+            <w:tcW w:type="dxa" w:w="1928"/>
           </w:tcPr>
           <w:p>
             <w:pPr>
@@ -1132,13 +1190,13 @@
                 <w:b w:val="0"/>
                 <w:sz w:val="17"/>
               </w:rPr>
-              <w:t>U 字は全席名札。サイド列・教室型は机あり・卓上マイクなし。名札はリソースパーソン、アドバイザー国、オブザーバー、国際機関（AHA センター等）に付け、その他一般参加者は自由席。シアター席は椅子のみ。卓上マイクは U 字と前方卓のみ。</w:t>
+              <w:t>22名</w:t>
             </w:r>
           </w:p>
         </w:tc>
         <w:tc>
           <w:tcPr>
-            <w:tcW w:type="dxa" w:w="2268"/>
+            <w:tcW w:type="dxa" w:w="6463"/>
           </w:tcPr>
           <w:p>
             <w:pPr>
@@ -1150,7 +1208,7 @@
                 <w:b w:val="0"/>
                 <w:sz w:val="17"/>
               </w:rPr>
-              <w:t>WhatsApp 9/24 荒木田→Sylvia</w:t>
+              <w:t>ADPC 2（→4名予定）、AHA センター、JICA フィジー櫻井氏、仙台市4（高橋副市長ほか）、JBP、JAXA 上田氏、西川専門員、東北大小野教授、近畿大、三重大、Mercy Malaysia、Oxfam、ADB、UNHAS、インドネシア環境省、バクー州立大2 ほか</w:t>
             </w:r>
           </w:p>
         </w:tc>
@@ -1158,7 +1216,7 @@
       <w:tr>
         <w:tc>
           <w:tcPr>
-            <w:tcW w:type="dxa" w:w="1361"/>
+            <w:tcW w:type="dxa" w:w="1474"/>
           </w:tcPr>
           <w:p>
             <w:pPr>
@@ -1170,13 +1228,13 @@
                 <w:b w:val="0"/>
                 <w:sz w:val="17"/>
               </w:rPr>
-              <w:t>機材（新）</w:t>
+              <w:t>ADRC</w:t>
             </w:r>
           </w:p>
         </w:tc>
         <w:tc>
           <w:tcPr>
-            <w:tcW w:type="dxa" w:w="6236"/>
+            <w:tcW w:type="dxa" w:w="1928"/>
           </w:tcPr>
           <w:p>
             <w:pPr>
@@ -1188,13 +1246,13 @@
                 <w:b w:val="0"/>
                 <w:sz w:val="17"/>
               </w:rPr>
-              <w:t>卓上マイク約22（U 14＋前方最大8）、スタンド4、ハンド2、演壇マイク、外部カメラ（見積の選択肢）、双方向音声、録画、有線 LAN 1回線、タイマー、ユニバーサルアダプタ5。Wi-Fi は Zoom を有線に逃がせば 10Mbps で可。</w:t>
+              <w:t>12名（現地）＋4名（オンライン）</w:t>
             </w:r>
           </w:p>
         </w:tc>
         <w:tc>
           <w:tcPr>
-            <w:tcW w:type="dxa" w:w="2268"/>
+            <w:tcW w:type="dxa" w:w="6463"/>
           </w:tcPr>
           <w:p>
             <w:pPr>
@@ -1206,7 +1264,7 @@
                 <w:b w:val="0"/>
                 <w:sz w:val="17"/>
               </w:rPr>
-              <w:t>荒木田→Sylvia 9/24 メール</w:t>
+              <w:t>現地 73名。リソース2名・ADPC 2名・日本政府等を加えると最大 83名</w:t>
             </w:r>
           </w:p>
         </w:tc>
@@ -1214,7 +1272,7 @@
       <w:tr>
         <w:tc>
           <w:tcPr>
-            <w:tcW w:type="dxa" w:w="1361"/>
+            <w:tcW w:type="dxa" w:w="1474"/>
           </w:tcPr>
           <w:p>
             <w:pPr>
@@ -1226,13 +1284,13 @@
                 <w:b w:val="0"/>
                 <w:sz w:val="17"/>
               </w:rPr>
-              <w:t>バナー（新）</w:t>
+              <w:t>要注意</w:t>
             </w:r>
           </w:p>
         </w:tc>
         <w:tc>
           <w:tcPr>
-            <w:tcW w:type="dxa" w:w="6236"/>
+            <w:tcW w:type="dxa" w:w="1928"/>
           </w:tcPr>
           <w:p>
             <w:pPr>
@@ -1244,13 +1302,13 @@
                 <w:b w:val="0"/>
                 <w:sz w:val="17"/>
               </w:rPr>
-              <w:t>COSEM/SCDF のデザイン案で可。修正依頼2点: 上段のロゴ・国旗の上下中心線を揃え両国旗を同サイズに、正式名称「Asian Conference on Disaster Reduction 2026」を大きく。掲載文言は大会名・会期（28-29 Oct）・会場（Singapore Expo Peridot Room）。物理バナー。寸法は EXPO 照会中。</w:t>
+              <w:t>フィジー、タイ</w:t>
             </w:r>
           </w:p>
         </w:tc>
         <w:tc>
           <w:tcPr>
-            <w:tcW w:type="dxa" w:w="2268"/>
+            <w:tcW w:type="dxa" w:w="6463"/>
           </w:tcPr>
           <w:p>
             <w:pPr>
@@ -1262,511 +1320,7 @@
                 <w:b w:val="0"/>
                 <w:sz w:val="17"/>
               </w:rPr>
-              <w:t>WhatsApp 9/24 荒木田→Sylvia</w:t>
-            </w:r>
-          </w:p>
-        </w:tc>
-      </w:tr>
-      <w:tr>
-        <w:tc>
-          <w:tcPr>
-            <w:tcW w:type="dxa" w:w="1361"/>
-          </w:tcPr>
-          <w:p>
-            <w:pPr>
-              <w:spacing w:after="0" w:line="240" w:lineRule="auto"/>
-            </w:pPr>
-            <w:r/>
-            <w:r>
-              <w:rPr>
-                <w:b w:val="0"/>
-                <w:sz w:val="17"/>
-              </w:rPr>
-              <w:t>登録（新）</w:t>
-            </w:r>
-          </w:p>
-        </w:tc>
-        <w:tc>
-          <w:tcPr>
-            <w:tcW w:type="dxa" w:w="6236"/>
-          </w:tcPr>
-          <w:p>
-            <w:pPr>
-              <w:spacing w:after="0" w:line="240" w:lineRule="auto"/>
-            </w:pPr>
-            <w:r/>
-            <w:r>
-              <w:rPr>
-                <w:b w:val="0"/>
-                <w:sz w:val="17"/>
-              </w:rPr>
-              <w:t>ブルネイ1名（Rina Nurhafizah、9/20）、韓国3名（Kim Ingeon・Lee Taekgeon・Song Hana、MOIS、9/21）、COSEM Fabian Tan 氏（9/24）、一般オンライン1名。タイは DDPM が Prasong Thammapala 氏（NDWC 所長）を指名予定、ADRC は1名分負担と回答済み。西川専門員は SIDEX 3日目の登壇者で、Welcome Dinner 招待のためリソース登録（費用は COSEM 持ち）。</w:t>
-            </w:r>
-          </w:p>
-        </w:tc>
-        <w:tc>
-          <w:tcPr>
-            <w:tcW w:type="dxa" w:w="2268"/>
-          </w:tcPr>
-          <w:p>
-            <w:pPr>
-              <w:spacing w:after="0" w:line="240" w:lineRule="auto"/>
-            </w:pPr>
-            <w:r/>
-            <w:r>
-              <w:rPr>
-                <w:b w:val="0"/>
-                <w:sz w:val="17"/>
-              </w:rPr>
-              <w:t>藤本 9/24、吉田 9/22、児玉 9/24</w:t>
-            </w:r>
-          </w:p>
-        </w:tc>
-      </w:tr>
-      <w:tr>
-        <w:tc>
-          <w:tcPr>
-            <w:tcW w:type="dxa" w:w="1361"/>
-          </w:tcPr>
-          <w:p>
-            <w:pPr>
-              <w:spacing w:after="0" w:line="240" w:lineRule="auto"/>
-            </w:pPr>
-            <w:r/>
-            <w:r>
-              <w:rPr>
-                <w:b w:val="0"/>
-                <w:sz w:val="17"/>
-              </w:rPr>
-              <w:t>投影・AV</w:t>
-            </w:r>
-          </w:p>
-        </w:tc>
-        <w:tc>
-          <w:tcPr>
-            <w:tcW w:type="dxa" w:w="6236"/>
-          </w:tcPr>
-          <w:p>
-            <w:pPr>
-              <w:spacing w:after="0" w:line="240" w:lineRule="auto"/>
-            </w:pPr>
-            <w:r/>
-            <w:r>
-              <w:rPr>
-                <w:b w:val="0"/>
-                <w:sz w:val="17"/>
-              </w:rPr>
-              <w:t>Peridot 203: 21,000lm 2560×1600。201-202: 8,000lm 1920×1200。HDMI 1本で全面ミラー。切替は AV オペレータ。演壇にマイクなし。クリッカー1本無償。タイマーなし。</w:t>
-            </w:r>
-          </w:p>
-        </w:tc>
-        <w:tc>
-          <w:tcPr>
-            <w:tcW w:type="dxa" w:w="2268"/>
-          </w:tcPr>
-          <w:p>
-            <w:pPr>
-              <w:spacing w:after="0" w:line="240" w:lineRule="auto"/>
-            </w:pPr>
-            <w:r/>
-            <w:r>
-              <w:rPr>
-                <w:b w:val="0"/>
-                <w:sz w:val="17"/>
-              </w:rPr>
-              <w:t>Sylvia 9/22</w:t>
-            </w:r>
-          </w:p>
-        </w:tc>
-      </w:tr>
-      <w:tr>
-        <w:tc>
-          <w:tcPr>
-            <w:tcW w:type="dxa" w:w="1361"/>
-          </w:tcPr>
-          <w:p>
-            <w:pPr>
-              <w:spacing w:after="0" w:line="240" w:lineRule="auto"/>
-            </w:pPr>
-            <w:r/>
-            <w:r>
-              <w:rPr>
-                <w:b w:val="0"/>
-                <w:sz w:val="17"/>
-              </w:rPr>
-              <w:t>通信</w:t>
-            </w:r>
-          </w:p>
-        </w:tc>
-        <w:tc>
-          <w:tcPr>
-            <w:tcW w:type="dxa" w:w="6236"/>
-          </w:tcPr>
-          <w:p>
-            <w:pPr>
-              <w:spacing w:after="0" w:line="240" w:lineRule="auto"/>
-            </w:pPr>
-            <w:r/>
-            <w:r>
-              <w:rPr>
-                <w:b w:val="0"/>
-                <w:sz w:val="17"/>
-              </w:rPr>
-              <w:t>無料 Wi-Fi 10Mbps・ランディングページ付き。有線 LAN は S$1,000＋GST／回線。COSEM が他業者を探す。</w:t>
-            </w:r>
-          </w:p>
-        </w:tc>
-        <w:tc>
-          <w:tcPr>
-            <w:tcW w:type="dxa" w:w="2268"/>
-          </w:tcPr>
-          <w:p>
-            <w:pPr>
-              <w:spacing w:after="0" w:line="240" w:lineRule="auto"/>
-            </w:pPr>
-            <w:r/>
-            <w:r>
-              <w:rPr>
-                <w:b w:val="0"/>
-                <w:sz w:val="17"/>
-              </w:rPr>
-              <w:t>Sylvia 9/22</w:t>
-            </w:r>
-          </w:p>
-        </w:tc>
-      </w:tr>
-      <w:tr>
-        <w:tc>
-          <w:tcPr>
-            <w:tcW w:type="dxa" w:w="1361"/>
-          </w:tcPr>
-          <w:p>
-            <w:pPr>
-              <w:spacing w:after="0" w:line="240" w:lineRule="auto"/>
-            </w:pPr>
-            <w:r/>
-            <w:r>
-              <w:rPr>
-                <w:b w:val="0"/>
-                <w:sz w:val="17"/>
-              </w:rPr>
-              <w:t>TS モデレーター</w:t>
-            </w:r>
-          </w:p>
-        </w:tc>
-        <w:tc>
-          <w:tcPr>
-            <w:tcW w:type="dxa" w:w="6236"/>
-          </w:tcPr>
-          <w:p>
-            <w:pPr>
-              <w:spacing w:after="0" w:line="240" w:lineRule="auto"/>
-            </w:pPr>
-            <w:r/>
-            <w:r>
-              <w:rPr>
-                <w:b w:val="0"/>
-                <w:sz w:val="17"/>
-              </w:rPr>
-              <w:t>Lieutenant Colonel Chen Yong Kai, Deputy Commander, 3rd SCDF Division。予備 LTC Adrian はプログラム・レセプションに含めない。6人目も他の登壇者と同待遇。登壇者はフィールドトリップ参加可（空きがあれば）。</w:t>
-            </w:r>
-          </w:p>
-        </w:tc>
-        <w:tc>
-          <w:tcPr>
-            <w:tcW w:type="dxa" w:w="2268"/>
-          </w:tcPr>
-          <w:p>
-            <w:pPr>
-              <w:spacing w:after="0" w:line="240" w:lineRule="auto"/>
-            </w:pPr>
-            <w:r/>
-            <w:r>
-              <w:rPr>
-                <w:b w:val="0"/>
-                <w:sz w:val="17"/>
-              </w:rPr>
-              <w:t>Sylvia 9/17・9/18</w:t>
-            </w:r>
-          </w:p>
-        </w:tc>
-      </w:tr>
-      <w:tr>
-        <w:tc>
-          <w:tcPr>
-            <w:tcW w:type="dxa" w:w="1361"/>
-          </w:tcPr>
-          <w:p>
-            <w:pPr>
-              <w:spacing w:after="0" w:line="240" w:lineRule="auto"/>
-            </w:pPr>
-            <w:r/>
-            <w:r>
-              <w:rPr>
-                <w:b w:val="0"/>
-                <w:sz w:val="17"/>
-              </w:rPr>
-              <w:t>ビザ</w:t>
-            </w:r>
-          </w:p>
-        </w:tc>
-        <w:tc>
-          <w:tcPr>
-            <w:tcW w:type="dxa" w:w="6236"/>
-          </w:tcPr>
-          <w:p>
-            <w:pPr>
-              <w:spacing w:after="0" w:line="240" w:lineRule="auto"/>
-            </w:pPr>
-            <w:r/>
-            <w:r>
-              <w:rPr>
-                <w:b w:val="0"/>
-                <w:sz w:val="17"/>
-              </w:rPr>
-              <w:t>ICA 一次情報: ネパール・インドネシア不要、ウズベキスタン・タジキスタン要。田中: 旅券写し受領済み、残存6か月確認中、Form 14A は本人記入、ビザ不要登録者には一行連絡。ウズベキスタン登壇者はビザ要と田中へ回答済み。</w:t>
-            </w:r>
-          </w:p>
-        </w:tc>
-        <w:tc>
-          <w:tcPr>
-            <w:tcW w:type="dxa" w:w="2268"/>
-          </w:tcPr>
-          <w:p>
-            <w:pPr>
-              <w:spacing w:after="0" w:line="240" w:lineRule="auto"/>
-            </w:pPr>
-            <w:r/>
-            <w:r>
-              <w:rPr>
-                <w:b w:val="0"/>
-                <w:sz w:val="17"/>
-              </w:rPr>
-              <w:t>ICA、田中 9/18、荒木田 9/24</w:t>
-            </w:r>
-          </w:p>
-        </w:tc>
-      </w:tr>
-      <w:tr>
-        <w:tc>
-          <w:tcPr>
-            <w:tcW w:type="dxa" w:w="1361"/>
-          </w:tcPr>
-          <w:p>
-            <w:pPr>
-              <w:spacing w:after="0" w:line="240" w:lineRule="auto"/>
-            </w:pPr>
-            <w:r/>
-            <w:r>
-              <w:rPr>
-                <w:b w:val="0"/>
-                <w:sz w:val="17"/>
-              </w:rPr>
-              <w:t>フィールドトリップ</w:t>
-            </w:r>
-          </w:p>
-        </w:tc>
-        <w:tc>
-          <w:tcPr>
-            <w:tcW w:type="dxa" w:w="6236"/>
-          </w:tcPr>
-          <w:p>
-            <w:pPr>
-              <w:spacing w:after="0" w:line="240" w:lineRule="auto"/>
-            </w:pPr>
-            <w:r/>
-            <w:r>
-              <w:rPr>
-                <w:b w:val="0"/>
-                <w:sz w:val="17"/>
-              </w:rPr>
-              <w:t>13:00 出発・16:15 終了（WhatsApp 配布の最新版）。ADRC Web 用アジェンダ v2 と整合。</w:t>
-            </w:r>
-          </w:p>
-        </w:tc>
-        <w:tc>
-          <w:tcPr>
-            <w:tcW w:type="dxa" w:w="2268"/>
-          </w:tcPr>
-          <w:p>
-            <w:pPr>
-              <w:spacing w:after="0" w:line="240" w:lineRule="auto"/>
-            </w:pPr>
-            <w:r/>
-            <w:r>
-              <w:rPr>
-                <w:b w:val="0"/>
-                <w:sz w:val="17"/>
-              </w:rPr>
-              <w:t>WhatsApp、アジェンダ v2</w:t>
-            </w:r>
-          </w:p>
-        </w:tc>
-      </w:tr>
-      <w:tr>
-        <w:tc>
-          <w:tcPr>
-            <w:tcW w:type="dxa" w:w="1361"/>
-          </w:tcPr>
-          <w:p>
-            <w:pPr>
-              <w:spacing w:after="0" w:line="240" w:lineRule="auto"/>
-            </w:pPr>
-            <w:r/>
-            <w:r>
-              <w:rPr>
-                <w:b w:val="0"/>
-                <w:sz w:val="17"/>
-              </w:rPr>
-              <w:t>レセプション</w:t>
-            </w:r>
-          </w:p>
-        </w:tc>
-        <w:tc>
-          <w:tcPr>
-            <w:tcW w:type="dxa" w:w="6236"/>
-          </w:tcPr>
-          <w:p>
-            <w:pPr>
-              <w:spacing w:after="0" w:line="240" w:lineRule="auto"/>
-            </w:pPr>
-            <w:r/>
-            <w:r>
-              <w:rPr>
-                <w:b w:val="0"/>
-                <w:sz w:val="17"/>
-              </w:rPr>
-              <w:t>シンガポール側は Comr＋Alan Chow＋LTC Chen、COSEM は Leow 氏・Sylvia 氏ほか。招待状は大使館から全参加者へ。</w:t>
-            </w:r>
-          </w:p>
-        </w:tc>
-        <w:tc>
-          <w:tcPr>
-            <w:tcW w:type="dxa" w:w="2268"/>
-          </w:tcPr>
-          <w:p>
-            <w:pPr>
-              <w:spacing w:after="0" w:line="240" w:lineRule="auto"/>
-            </w:pPr>
-            <w:r/>
-            <w:r>
-              <w:rPr>
-                <w:b w:val="0"/>
-                <w:sz w:val="17"/>
-              </w:rPr>
-              <w:t>WhatsApp 9/17</w:t>
-            </w:r>
-          </w:p>
-        </w:tc>
-      </w:tr>
-      <w:tr>
-        <w:tc>
-          <w:tcPr>
-            <w:tcW w:type="dxa" w:w="1361"/>
-          </w:tcPr>
-          <w:p>
-            <w:pPr>
-              <w:spacing w:after="0" w:line="240" w:lineRule="auto"/>
-            </w:pPr>
-            <w:r/>
-            <w:r>
-              <w:rPr>
-                <w:b w:val="0"/>
-                <w:sz w:val="17"/>
-              </w:rPr>
-              <w:t>リソース航空券</w:t>
-            </w:r>
-          </w:p>
-        </w:tc>
-        <w:tc>
-          <w:tcPr>
-            <w:tcW w:type="dxa" w:w="6236"/>
-          </w:tcPr>
-          <w:p>
-            <w:pPr>
-              <w:spacing w:after="0" w:line="240" w:lineRule="auto"/>
-            </w:pPr>
-            <w:r/>
-            <w:r>
-              <w:rPr>
-                <w:b w:val="0"/>
-                <w:sz w:val="17"/>
-              </w:rPr>
-              <w:t>インドネシア（Yenni Vetrita 氏）: GA828（27日）で打診、復路は30日夕で照会中。ネパール（Pradip Khatiwada 氏）: Air India 経由か SQ 直行かをアドミと相談中。見積取得中と池田へ連絡済み。</w:t>
-            </w:r>
-          </w:p>
-        </w:tc>
-        <w:tc>
-          <w:tcPr>
-            <w:tcW w:type="dxa" w:w="2268"/>
-          </w:tcPr>
-          <w:p>
-            <w:pPr>
-              <w:spacing w:after="0" w:line="240" w:lineRule="auto"/>
-            </w:pPr>
-            <w:r/>
-            <w:r>
-              <w:rPr>
-                <w:b w:val="0"/>
-                <w:sz w:val="17"/>
-              </w:rPr>
-              <w:t>藤本 9/18、荒木田 9/24</w:t>
-            </w:r>
-          </w:p>
-        </w:tc>
-      </w:tr>
-      <w:tr>
-        <w:tc>
-          <w:tcPr>
-            <w:tcW w:type="dxa" w:w="1361"/>
-          </w:tcPr>
-          <w:p>
-            <w:pPr>
-              <w:spacing w:after="0" w:line="240" w:lineRule="auto"/>
-            </w:pPr>
-            <w:r/>
-            <w:r>
-              <w:rPr>
-                <w:b w:val="0"/>
-                <w:sz w:val="17"/>
-              </w:rPr>
-              <w:t>その他</w:t>
-            </w:r>
-          </w:p>
-        </w:tc>
-        <w:tc>
-          <w:tcPr>
-            <w:tcW w:type="dxa" w:w="6236"/>
-          </w:tcPr>
-          <w:p>
-            <w:pPr>
-              <w:spacing w:after="0" w:line="240" w:lineRule="auto"/>
-            </w:pPr>
-            <w:r/>
-            <w:r>
-              <w:rPr>
-                <w:b w:val="0"/>
-                <w:sz w:val="17"/>
-              </w:rPr>
-              <w:t>インド: 最終承認・旅券待ちで発券保留。NZ 3人目はメンバー国と同扱い。ADB 請求は Sylvia 氏が処理済み。ED の食事制限なし。</w:t>
-            </w:r>
-          </w:p>
-        </w:tc>
-        <w:tc>
-          <w:tcPr>
-            <w:tcW w:type="dxa" w:w="2268"/>
-          </w:tcPr>
-          <w:p>
-            <w:pPr>
-              <w:spacing w:after="0" w:line="240" w:lineRule="auto"/>
-            </w:pPr>
-            <w:r/>
-            <w:r>
-              <w:rPr>
-                <w:b w:val="0"/>
-                <w:sz w:val="17"/>
-              </w:rPr>
-              <w:t>田中・藤中・吉田</w:t>
+              <w:t>フィジー Naipolioni 氏はフライト手配のやり取りが進まず不透明（櫻井氏に依頼）。タイは DDPM からの連絡が途絶、ヘッドは旅程のみでホテルなし</w:t>
             </w:r>
           </w:p>
         </w:tc>
@@ -1791,7 +1345,664 @@
           <w:color w:val="1F3864"/>
           <w:sz w:val="24"/>
         </w:rPr>
-        <w:t>3. 所内で決めること</w:t>
+        <w:t>3. 直近の期限（更新）</w:t>
+      </w:r>
+    </w:p>
+    <w:tbl>
+      <w:tblPr>
+        <w:tblStyle w:val="TableGrid"/>
+        <w:tblW w:type="auto" w:w="0"/>
+        <w:jc w:val="center"/>
+        <w:tblLayout w:type="fixed"/>
+        <w:tblLook w:firstColumn="1" w:firstRow="1" w:lastColumn="0" w:lastRow="0" w:noHBand="0" w:noVBand="1" w:val="04A0"/>
+      </w:tblPr>
+      <w:tblGrid>
+        <w:gridCol w:w="1814"/>
+        <w:gridCol w:w="3628"/>
+        <w:gridCol w:w="4422"/>
+      </w:tblGrid>
+      <w:tr>
+        <w:tc>
+          <w:tcPr>
+            <w:tcW w:type="dxa" w:w="1814"/>
+            <w:shd w:val="clear" w:color="auto" w:fill="1F3864"/>
+          </w:tcPr>
+          <w:p>
+            <w:pPr>
+              <w:spacing w:after="0" w:line="240" w:lineRule="auto"/>
+            </w:pPr>
+            <w:r/>
+            <w:r>
+              <w:rPr>
+                <w:b/>
+                <w:color w:val="FFFFFF"/>
+                <w:sz w:val="17"/>
+              </w:rPr>
+              <w:t>日付</w:t>
+            </w:r>
+          </w:p>
+        </w:tc>
+        <w:tc>
+          <w:tcPr>
+            <w:tcW w:type="dxa" w:w="3628"/>
+            <w:shd w:val="clear" w:color="auto" w:fill="1F3864"/>
+          </w:tcPr>
+          <w:p>
+            <w:pPr>
+              <w:spacing w:after="0" w:line="240" w:lineRule="auto"/>
+            </w:pPr>
+            <w:r/>
+            <w:r>
+              <w:rPr>
+                <w:b/>
+                <w:color w:val="FFFFFF"/>
+                <w:sz w:val="17"/>
+              </w:rPr>
+              <w:t>事項</w:t>
+            </w:r>
+          </w:p>
+        </w:tc>
+        <w:tc>
+          <w:tcPr>
+            <w:tcW w:type="dxa" w:w="4422"/>
+            <w:shd w:val="clear" w:color="auto" w:fill="1F3864"/>
+          </w:tcPr>
+          <w:p>
+            <w:pPr>
+              <w:spacing w:after="0" w:line="240" w:lineRule="auto"/>
+            </w:pPr>
+            <w:r/>
+            <w:r>
+              <w:rPr>
+                <w:b/>
+                <w:color w:val="FFFFFF"/>
+                <w:sz w:val="17"/>
+              </w:rPr>
+              <w:t>備考</w:t>
+            </w:r>
+          </w:p>
+        </w:tc>
+      </w:tr>
+      <w:tr>
+        <w:tc>
+          <w:tcPr>
+            <w:tcW w:type="dxa" w:w="1814"/>
+          </w:tcPr>
+          <w:p>
+            <w:pPr>
+              <w:spacing w:after="0" w:line="240" w:lineRule="auto"/>
+            </w:pPr>
+            <w:r/>
+            <w:r>
+              <w:rPr>
+                <w:b w:val="0"/>
+                <w:sz w:val="17"/>
+              </w:rPr>
+              <w:t>9/25（金）16:30-17:30</w:t>
+            </w:r>
+          </w:p>
+        </w:tc>
+        <w:tc>
+          <w:tcPr>
+            <w:tcW w:type="dxa" w:w="3628"/>
+          </w:tcPr>
+          <w:p>
+            <w:pPr>
+              <w:spacing w:after="0" w:line="240" w:lineRule="auto"/>
+            </w:pPr>
+            <w:r/>
+            <w:r>
+              <w:rPr>
+                <w:b w:val="0"/>
+                <w:sz w:val="17"/>
+              </w:rPr>
+              <w:t>内閣府 連絡会</w:t>
+            </w:r>
+          </w:p>
+        </w:tc>
+        <w:tc>
+          <w:tcPr>
+            <w:tcW w:type="dxa" w:w="4422"/>
+          </w:tcPr>
+          <w:p>
+            <w:pPr>
+              <w:spacing w:after="0" w:line="240" w:lineRule="auto"/>
+            </w:pPr>
+            <w:r/>
+            <w:r>
+              <w:rPr>
+                <w:b w:val="0"/>
+                <w:sz w:val="17"/>
+              </w:rPr>
+              <w:t>第6項を参照</w:t>
+            </w:r>
+          </w:p>
+        </w:tc>
+      </w:tr>
+      <w:tr>
+        <w:tc>
+          <w:tcPr>
+            <w:tcW w:type="dxa" w:w="1814"/>
+          </w:tcPr>
+          <w:p>
+            <w:pPr>
+              <w:spacing w:after="0" w:line="240" w:lineRule="auto"/>
+            </w:pPr>
+            <w:r/>
+            <w:r>
+              <w:rPr>
+                <w:b w:val="0"/>
+                <w:sz w:val="17"/>
+              </w:rPr>
+              <w:t>9/25（金）</w:t>
+            </w:r>
+          </w:p>
+        </w:tc>
+        <w:tc>
+          <w:tcPr>
+            <w:tcW w:type="dxa" w:w="3628"/>
+          </w:tcPr>
+          <w:p>
+            <w:pPr>
+              <w:spacing w:after="0" w:line="240" w:lineRule="auto"/>
+            </w:pPr>
+            <w:r/>
+            <w:r>
+              <w:rPr>
+                <w:b w:val="0"/>
+                <w:sz w:val="17"/>
+              </w:rPr>
+              <w:t>ビザ書類（Form 14A・写真）返送期限</w:t>
+            </w:r>
+          </w:p>
+        </w:tc>
+        <w:tc>
+          <w:tcPr>
+            <w:tcW w:type="dxa" w:w="4422"/>
+          </w:tcPr>
+          <w:p>
+            <w:pPr>
+              <w:spacing w:after="0" w:line="240" w:lineRule="auto"/>
+            </w:pPr>
+            <w:r/>
+            <w:r>
+              <w:rPr>
+                <w:b w:val="0"/>
+                <w:sz w:val="17"/>
+              </w:rPr>
+              <w:t>インド3（Official なら不要）、パキスタン2</w:t>
+            </w:r>
+          </w:p>
+        </w:tc>
+      </w:tr>
+      <w:tr>
+        <w:tc>
+          <w:tcPr>
+            <w:tcW w:type="dxa" w:w="1814"/>
+          </w:tcPr>
+          <w:p>
+            <w:pPr>
+              <w:spacing w:after="0" w:line="240" w:lineRule="auto"/>
+            </w:pPr>
+            <w:r/>
+            <w:r>
+              <w:rPr>
+                <w:b w:val="0"/>
+                <w:sz w:val="17"/>
+              </w:rPr>
+              <w:t>9/26（土）</w:t>
+            </w:r>
+          </w:p>
+        </w:tc>
+        <w:tc>
+          <w:tcPr>
+            <w:tcW w:type="dxa" w:w="3628"/>
+          </w:tcPr>
+          <w:p>
+            <w:pPr>
+              <w:spacing w:after="0" w:line="240" w:lineRule="auto"/>
+            </w:pPr>
+            <w:r/>
+            <w:r>
+              <w:rPr>
+                <w:b w:val="0"/>
+                <w:sz w:val="17"/>
+              </w:rPr>
+              <w:t>ビザ申請受付開始（到着30日前）</w:t>
+            </w:r>
+          </w:p>
+        </w:tc>
+        <w:tc>
+          <w:tcPr>
+            <w:tcW w:type="dxa" w:w="4422"/>
+          </w:tcPr>
+          <w:p>
+            <w:pPr>
+              <w:spacing w:after="0" w:line="240" w:lineRule="auto"/>
+            </w:pPr>
+            <w:r/>
+            <w:r>
+              <w:rPr>
+                <w:b w:val="0"/>
+                <w:sz w:val="17"/>
+              </w:rPr>
+              <w:t>COSEM が Corppass で提出。実務上は 9/28（月）以降</w:t>
+            </w:r>
+          </w:p>
+        </w:tc>
+      </w:tr>
+      <w:tr>
+        <w:tc>
+          <w:tcPr>
+            <w:tcW w:type="dxa" w:w="1814"/>
+          </w:tcPr>
+          <w:p>
+            <w:pPr>
+              <w:spacing w:after="0" w:line="240" w:lineRule="auto"/>
+            </w:pPr>
+            <w:r/>
+            <w:r>
+              <w:rPr>
+                <w:b w:val="0"/>
+                <w:sz w:val="17"/>
+              </w:rPr>
+              <w:t>9/27（日）〜10/7</w:t>
+            </w:r>
+          </w:p>
+        </w:tc>
+        <w:tc>
+          <w:tcPr>
+            <w:tcW w:type="dxa" w:w="3628"/>
+          </w:tcPr>
+          <w:p>
+            <w:pPr>
+              <w:spacing w:after="0" w:line="240" w:lineRule="auto"/>
+            </w:pPr>
+            <w:r/>
+            <w:r>
+              <w:rPr>
+                <w:b w:val="0"/>
+                <w:sz w:val="17"/>
+              </w:rPr>
+              <w:t>池田 出張</w:t>
+            </w:r>
+          </w:p>
+        </w:tc>
+        <w:tc>
+          <w:tcPr>
+            <w:tcW w:type="dxa" w:w="4422"/>
+          </w:tcPr>
+          <w:p>
+            <w:pPr>
+              <w:spacing w:after="0" w:line="240" w:lineRule="auto"/>
+            </w:pPr>
+            <w:r/>
+            <w:r>
+              <w:rPr>
+                <w:b w:val="0"/>
+                <w:sz w:val="17"/>
+              </w:rPr>
+              <w:t>Mizan は 〜10/4。TS 担当が不在のため出先と国内の分担を明確に</w:t>
+            </w:r>
+          </w:p>
+        </w:tc>
+      </w:tr>
+      <w:tr>
+        <w:tc>
+          <w:tcPr>
+            <w:tcW w:type="dxa" w:w="1814"/>
+          </w:tcPr>
+          <w:p>
+            <w:pPr>
+              <w:spacing w:after="0" w:line="240" w:lineRule="auto"/>
+            </w:pPr>
+            <w:r/>
+            <w:r>
+              <w:rPr>
+                <w:b w:val="0"/>
+                <w:sz w:val="17"/>
+              </w:rPr>
+              <w:t>9/29（月）午前</w:t>
+            </w:r>
+          </w:p>
+        </w:tc>
+        <w:tc>
+          <w:tcPr>
+            <w:tcW w:type="dxa" w:w="3628"/>
+          </w:tcPr>
+          <w:p>
+            <w:pPr>
+              <w:spacing w:after="0" w:line="240" w:lineRule="auto"/>
+            </w:pPr>
+            <w:r/>
+            <w:r>
+              <w:rPr>
+                <w:b w:val="0"/>
+                <w:sz w:val="17"/>
+              </w:rPr>
+              <w:t>第6回 COSEM 合同会議（変更）</w:t>
+            </w:r>
+          </w:p>
+        </w:tc>
+        <w:tc>
+          <w:tcPr>
+            <w:tcW w:type="dxa" w:w="4422"/>
+          </w:tcPr>
+          <w:p>
+            <w:pPr>
+              <w:spacing w:after="0" w:line="240" w:lineRule="auto"/>
+            </w:pPr>
+            <w:r/>
+            <w:r>
+              <w:rPr>
+                <w:b w:val="0"/>
+                <w:sz w:val="17"/>
+              </w:rPr>
+              <w:t>RT 分割案、3人目以降の費用、Dorsett 増枠、バナー期間、AV 見積・支払、07:30 入室・前日設営</w:t>
+            </w:r>
+          </w:p>
+        </w:tc>
+      </w:tr>
+      <w:tr>
+        <w:tc>
+          <w:tcPr>
+            <w:tcW w:type="dxa" w:w="1814"/>
+          </w:tcPr>
+          <w:p>
+            <w:pPr>
+              <w:spacing w:after="0" w:line="240" w:lineRule="auto"/>
+            </w:pPr>
+            <w:r/>
+            <w:r>
+              <w:rPr>
+                <w:b w:val="0"/>
+                <w:sz w:val="17"/>
+              </w:rPr>
+              <w:t>9/29（月）</w:t>
+            </w:r>
+          </w:p>
+        </w:tc>
+        <w:tc>
+          <w:tcPr>
+            <w:tcW w:type="dxa" w:w="3628"/>
+          </w:tcPr>
+          <w:p>
+            <w:pPr>
+              <w:spacing w:after="0" w:line="240" w:lineRule="auto"/>
+            </w:pPr>
+            <w:r/>
+            <w:r>
+              <w:rPr>
+                <w:b w:val="0"/>
+                <w:sz w:val="17"/>
+              </w:rPr>
+              <w:t>SCDF モデレーターとのオンラインブリーフィング 第一候補</w:t>
+            </w:r>
+          </w:p>
+        </w:tc>
+        <w:tc>
+          <w:tcPr>
+            <w:tcW w:type="dxa" w:w="4422"/>
+          </w:tcPr>
+          <w:p>
+            <w:pPr>
+              <w:spacing w:after="0" w:line="240" w:lineRule="auto"/>
+            </w:pPr>
+            <w:r/>
+            <w:r>
+              <w:rPr>
+                <w:b w:val="0"/>
+                <w:sz w:val="17"/>
+              </w:rPr>
+              <w:t>合同会議と同日。重複すれば 9/30、10/8、10/9</w:t>
+            </w:r>
+          </w:p>
+        </w:tc>
+      </w:tr>
+      <w:tr>
+        <w:tc>
+          <w:tcPr>
+            <w:tcW w:type="dxa" w:w="1814"/>
+          </w:tcPr>
+          <w:p>
+            <w:pPr>
+              <w:spacing w:after="0" w:line="240" w:lineRule="auto"/>
+            </w:pPr>
+            <w:r/>
+            <w:r>
+              <w:rPr>
+                <w:b w:val="0"/>
+                <w:sz w:val="17"/>
+              </w:rPr>
+              <w:t>10/2（金）</w:t>
+            </w:r>
+          </w:p>
+        </w:tc>
+        <w:tc>
+          <w:tcPr>
+            <w:tcW w:type="dxa" w:w="3628"/>
+          </w:tcPr>
+          <w:p>
+            <w:pPr>
+              <w:spacing w:after="0" w:line="240" w:lineRule="auto"/>
+            </w:pPr>
+            <w:r/>
+            <w:r>
+              <w:rPr>
+                <w:b w:val="0"/>
+                <w:sz w:val="17"/>
+              </w:rPr>
+              <w:t>TS 登壇者: タイトル・アブストラクト・略歴・写真</w:t>
+            </w:r>
+          </w:p>
+        </w:tc>
+        <w:tc>
+          <w:tcPr>
+            <w:tcW w:type="dxa" w:w="4422"/>
+          </w:tcPr>
+          <w:p>
+            <w:pPr>
+              <w:spacing w:after="0" w:line="240" w:lineRule="auto"/>
+            </w:pPr>
+            <w:r/>
+            <w:r>
+              <w:rPr>
+                <w:b w:val="0"/>
+                <w:sz w:val="17"/>
+              </w:rPr>
+              <w:t>ウズベキスタン、JAXA、内閣府（民間2社）は確定次第</w:t>
+            </w:r>
+          </w:p>
+        </w:tc>
+      </w:tr>
+      <w:tr>
+        <w:tc>
+          <w:tcPr>
+            <w:tcW w:type="dxa" w:w="1814"/>
+          </w:tcPr>
+          <w:p>
+            <w:pPr>
+              <w:spacing w:after="0" w:line="240" w:lineRule="auto"/>
+            </w:pPr>
+            <w:r/>
+            <w:r>
+              <w:rPr>
+                <w:b w:val="0"/>
+                <w:sz w:val="17"/>
+              </w:rPr>
+              <w:t>10/9（金）</w:t>
+            </w:r>
+          </w:p>
+        </w:tc>
+        <w:tc>
+          <w:tcPr>
+            <w:tcW w:type="dxa" w:w="3628"/>
+          </w:tcPr>
+          <w:p>
+            <w:pPr>
+              <w:spacing w:after="0" w:line="240" w:lineRule="auto"/>
+            </w:pPr>
+            <w:r/>
+            <w:r>
+              <w:rPr>
+                <w:b w:val="0"/>
+                <w:sz w:val="17"/>
+              </w:rPr>
+              <w:t>全事項の確定</w:t>
+            </w:r>
+          </w:p>
+        </w:tc>
+        <w:tc>
+          <w:tcPr>
+            <w:tcW w:type="dxa" w:w="4422"/>
+          </w:tcPr>
+          <w:p>
+            <w:pPr>
+              <w:spacing w:after="0" w:line="240" w:lineRule="auto"/>
+            </w:pPr>
+            <w:r/>
+            <w:r>
+              <w:rPr>
+                <w:b w:val="0"/>
+                <w:sz w:val="17"/>
+              </w:rPr>
+              <w:t>ロジ最終版・アジェンダ最終・SC 書類</w:t>
+            </w:r>
+          </w:p>
+        </w:tc>
+      </w:tr>
+      <w:tr>
+        <w:tc>
+          <w:tcPr>
+            <w:tcW w:type="dxa" w:w="1814"/>
+          </w:tcPr>
+          <w:p>
+            <w:pPr>
+              <w:spacing w:after="0" w:line="240" w:lineRule="auto"/>
+            </w:pPr>
+            <w:r/>
+            <w:r>
+              <w:rPr>
+                <w:b w:val="0"/>
+                <w:sz w:val="17"/>
+              </w:rPr>
+              <w:t>10/13（火）</w:t>
+            </w:r>
+          </w:p>
+        </w:tc>
+        <w:tc>
+          <w:tcPr>
+            <w:tcW w:type="dxa" w:w="3628"/>
+          </w:tcPr>
+          <w:p>
+            <w:pPr>
+              <w:spacing w:after="0" w:line="240" w:lineRule="auto"/>
+            </w:pPr>
+            <w:r/>
+            <w:r>
+              <w:rPr>
+                <w:b w:val="0"/>
+                <w:sz w:val="17"/>
+              </w:rPr>
+              <w:t>Final Announcement</w:t>
+            </w:r>
+          </w:p>
+        </w:tc>
+        <w:tc>
+          <w:tcPr>
+            <w:tcW w:type="dxa" w:w="4422"/>
+          </w:tcPr>
+          <w:p>
+            <w:pPr>
+              <w:spacing w:after="0" w:line="240" w:lineRule="auto"/>
+            </w:pPr>
+            <w:r/>
+            <w:r>
+              <w:rPr>
+                <w:b w:val="0"/>
+                <w:sz w:val="17"/>
+              </w:rPr>
+            </w:r>
+          </w:p>
+        </w:tc>
+      </w:tr>
+      <w:tr>
+        <w:tc>
+          <w:tcPr>
+            <w:tcW w:type="dxa" w:w="1814"/>
+          </w:tcPr>
+          <w:p>
+            <w:pPr>
+              <w:spacing w:after="0" w:line="240" w:lineRule="auto"/>
+            </w:pPr>
+            <w:r/>
+            <w:r>
+              <w:rPr>
+                <w:b w:val="0"/>
+                <w:sz w:val="17"/>
+              </w:rPr>
+              <w:t>10/20（火）</w:t>
+            </w:r>
+          </w:p>
+        </w:tc>
+        <w:tc>
+          <w:tcPr>
+            <w:tcW w:type="dxa" w:w="3628"/>
+          </w:tcPr>
+          <w:p>
+            <w:pPr>
+              <w:spacing w:after="0" w:line="240" w:lineRule="auto"/>
+            </w:pPr>
+            <w:r/>
+            <w:r>
+              <w:rPr>
+                <w:b w:val="0"/>
+                <w:sz w:val="17"/>
+              </w:rPr>
+              <w:t>TS スライド</w:t>
+            </w:r>
+          </w:p>
+        </w:tc>
+        <w:tc>
+          <w:tcPr>
+            <w:tcW w:type="dxa" w:w="4422"/>
+          </w:tcPr>
+          <w:p>
+            <w:pPr>
+              <w:spacing w:after="0" w:line="240" w:lineRule="auto"/>
+            </w:pPr>
+            <w:r/>
+            <w:r>
+              <w:rPr>
+                <w:b w:val="0"/>
+                <w:sz w:val="17"/>
+              </w:rPr>
+              <w:t>開催1週間前までに提出を督促</w:t>
+            </w:r>
+          </w:p>
+        </w:tc>
+      </w:tr>
+    </w:tbl>
+    <w:p>
+      <w:pPr>
+        <w:spacing w:after="40"/>
+      </w:pPr>
+    </w:p>
+    <w:p>
+      <w:pPr>
+        <w:spacing w:before="200" w:after="80"/>
+        <w:pBdr>
+          <w:bottom w:val="single" w:sz="6" w:space="1" w:color="1F3864"/>
+        </w:pBdr>
+      </w:pPr>
+      <w:r>
+        <w:rPr>
+          <w:b/>
+          <w:i w:val="0"/>
+          <w:color w:val="1F3864"/>
+          <w:sz w:val="24"/>
+        </w:rPr>
+        <w:t>4. 残る所内判断・未確定</w:t>
       </w:r>
     </w:p>
     <w:tbl>
@@ -1804,10 +2015,10 @@
       </w:tblPr>
       <w:tblGrid>
         <w:gridCol w:w="454"/>
-        <w:gridCol w:w="1474"/>
-        <w:gridCol w:w="3515"/>
+        <w:gridCol w:w="1928"/>
         <w:gridCol w:w="3061"/>
-        <w:gridCol w:w="1134"/>
+        <w:gridCol w:w="2835"/>
+        <w:gridCol w:w="1247"/>
       </w:tblGrid>
       <w:tr>
         <w:tc>
@@ -1832,7 +2043,7 @@
         </w:tc>
         <w:tc>
           <w:tcPr>
-            <w:tcW w:type="dxa" w:w="1474"/>
+            <w:tcW w:type="dxa" w:w="1928"/>
             <w:shd w:val="clear" w:color="auto" w:fill="1F3864"/>
           </w:tcPr>
           <w:p>
@@ -1852,26 +2063,6 @@
         </w:tc>
         <w:tc>
           <w:tcPr>
-            <w:tcW w:type="dxa" w:w="3515"/>
-            <w:shd w:val="clear" w:color="auto" w:fill="1F3864"/>
-          </w:tcPr>
-          <w:p>
-            <w:pPr>
-              <w:spacing w:after="0" w:line="240" w:lineRule="auto"/>
-            </w:pPr>
-            <w:r/>
-            <w:r>
-              <w:rPr>
-                <w:b/>
-                <w:color w:val="FFFFFF"/>
-                <w:sz w:val="17"/>
-              </w:rPr>
-              <w:t>現状と選択肢</w:t>
-            </w:r>
-          </w:p>
-        </w:tc>
-        <w:tc>
-          <w:tcPr>
             <w:tcW w:type="dxa" w:w="3061"/>
             <w:shd w:val="clear" w:color="auto" w:fill="1F3864"/>
           </w:tcPr>
@@ -1886,13 +2077,33 @@
                 <w:color w:val="FFFFFF"/>
                 <w:sz w:val="17"/>
               </w:rPr>
-              <w:t>提案</w:t>
+              <w:t>現状</w:t>
             </w:r>
           </w:p>
         </w:tc>
         <w:tc>
           <w:tcPr>
-            <w:tcW w:type="dxa" w:w="1134"/>
+            <w:tcW w:type="dxa" w:w="2835"/>
+            <w:shd w:val="clear" w:color="auto" w:fill="1F3864"/>
+          </w:tcPr>
+          <w:p>
+            <w:pPr>
+              <w:spacing w:after="0" w:line="240" w:lineRule="auto"/>
+            </w:pPr>
+            <w:r/>
+            <w:r>
+              <w:rPr>
+                <w:b/>
+                <w:color w:val="FFFFFF"/>
+                <w:sz w:val="17"/>
+              </w:rPr>
+              <w:t>次の一手</w:t>
+            </w:r>
+          </w:p>
+        </w:tc>
+        <w:tc>
+          <w:tcPr>
+            <w:tcW w:type="dxa" w:w="1247"/>
             <w:shd w:val="clear" w:color="auto" w:fill="1F3864"/>
           </w:tcPr>
           <w:p>
@@ -1932,7 +2143,7 @@
         </w:tc>
         <w:tc>
           <w:tcPr>
-            <w:tcW w:type="dxa" w:w="1474"/>
+            <w:tcW w:type="dxa" w:w="1928"/>
           </w:tcPr>
           <w:p>
             <w:pPr>
@@ -1944,25 +2155,7 @@
                 <w:b w:val="0"/>
                 <w:sz w:val="17"/>
               </w:rPr>
-              <w:t>Day 1 の前倒し（Sylvia 氏要望）</w:t>
-            </w:r>
-          </w:p>
-        </w:tc>
-        <w:tc>
-          <w:tcPr>
-            <w:tcW w:type="dxa" w:w="3515"/>
-          </w:tcPr>
-          <w:p>
-            <w:pPr>
-              <w:spacing w:after="0" w:line="240" w:lineRule="auto"/>
-            </w:pPr>
-            <w:r/>
-            <w:r>
-              <w:rPr>
-                <w:b w:val="0"/>
-                <w:sz w:val="17"/>
-              </w:rPr>
-              <w:t>RT・SC は短縮不可と回答済み。前倒しの可否は日本パビリオン開会式（GOH ツアー内、現行5分）の所要時間次第。田中から正式回答の依頼（9/18）が未対応。</w:t>
+              <w:t>Mizan のフライト</w:t>
             </w:r>
           </w:p>
         </w:tc>
@@ -1980,13 +2173,13 @@
                 <w:b w:val="0"/>
                 <w:sz w:val="17"/>
               </w:rPr>
-              <w:t>9/25 連絡会で内閣府の希望時間を確認し、前倒しできる場合は昼食を 11:45-12:30 に短縮、開会 12:30・RT 12:45-15:15・SC 15:30-16:30 として田中経由で回答。10/1 合同会議で確定。</w:t>
+              <w:t>唯一未確定。</w:t>
             </w:r>
           </w:p>
         </w:tc>
         <w:tc>
           <w:tcPr>
-            <w:tcW w:type="dxa" w:w="1134"/>
+            <w:tcW w:type="dxa" w:w="2835"/>
           </w:tcPr>
           <w:p>
             <w:pPr>
@@ -1998,7 +2191,25 @@
                 <w:b w:val="0"/>
                 <w:sz w:val="17"/>
               </w:rPr>
-              <w:t>荒木田 → 田中</w:t>
+              <w:t>本人に確認して手配。</w:t>
+            </w:r>
+          </w:p>
+        </w:tc>
+        <w:tc>
+          <w:tcPr>
+            <w:tcW w:type="dxa" w:w="1247"/>
+          </w:tcPr>
+          <w:p>
+            <w:pPr>
+              <w:spacing w:after="0" w:line="240" w:lineRule="auto"/>
+            </w:pPr>
+            <w:r/>
+            <w:r>
+              <w:rPr>
+                <w:b w:val="0"/>
+                <w:sz w:val="17"/>
+              </w:rPr>
+              <w:t>藤本・Mizan</w:t>
             </w:r>
           </w:p>
         </w:tc>
@@ -2024,7 +2235,7 @@
         </w:tc>
         <w:tc>
           <w:tcPr>
-            <w:tcW w:type="dxa" w:w="1474"/>
+            <w:tcW w:type="dxa" w:w="1928"/>
           </w:tcPr>
           <w:p>
             <w:pPr>
@@ -2036,25 +2247,7 @@
                 <w:b w:val="0"/>
                 <w:sz w:val="17"/>
               </w:rPr>
-              <w:t>ウズベキスタン枠</w:t>
-            </w:r>
-          </w:p>
-        </w:tc>
-        <w:tc>
-          <w:tcPr>
-            <w:tcW w:type="dxa" w:w="3515"/>
-          </w:tcPr>
-          <w:p>
-            <w:pPr>
-              <w:spacing w:after="0" w:line="240" w:lineRule="auto"/>
-            </w:pPr>
-            <w:r/>
-            <w:r>
-              <w:rPr>
-                <w:b w:val="0"/>
-                <w:sz w:val="17"/>
-              </w:rPr>
-              <w:t>9/24 の WhatsApp 再リマインドで連絡が取れ、2名を選出して登録する予定と確認。事務局から分かりやすい案内メールを再送するよう依頼済み。ビザ要（申請 9/26〜、3営業日）。TS 提出物は 10/2 締切。</w:t>
+              <w:t>フィールドトリップの点呼・誘導</w:t>
             </w:r>
           </w:p>
         </w:tc>
@@ -2072,13 +2265,13 @@
                 <w:b w:val="0"/>
                 <w:sz w:val="17"/>
               </w:rPr>
-              <w:t>登録が届き次第、田中にビザ書類（Form 14A・写真・旅券写し）を依頼し、池田へ登壇者名を連絡。10/2 に間に合わなければ提出期限だけ個別延長。</w:t>
+              <w:t>担当未定。</w:t>
             </w:r>
           </w:p>
         </w:tc>
         <w:tc>
           <w:tcPr>
-            <w:tcW w:type="dxa" w:w="1134"/>
+            <w:tcW w:type="dxa" w:w="2835"/>
           </w:tcPr>
           <w:p>
             <w:pPr>
@@ -2090,7 +2283,25 @@
                 <w:b w:val="0"/>
                 <w:sz w:val="17"/>
               </w:rPr>
-              <w:t>荒木田・田中・池田</w:t>
+              <w:t>COSEM の時間割確定後に動態表で割当。</w:t>
+            </w:r>
+          </w:p>
+        </w:tc>
+        <w:tc>
+          <w:tcPr>
+            <w:tcW w:type="dxa" w:w="1247"/>
+          </w:tcPr>
+          <w:p>
+            <w:pPr>
+              <w:spacing w:after="0" w:line="240" w:lineRule="auto"/>
+            </w:pPr>
+            <w:r/>
+            <w:r>
+              <w:rPr>
+                <w:b w:val="0"/>
+                <w:sz w:val="17"/>
+              </w:rPr>
+              <w:t>荒木田</w:t>
             </w:r>
           </w:p>
         </w:tc>
@@ -2116,7 +2327,7 @@
         </w:tc>
         <w:tc>
           <w:tcPr>
-            <w:tcW w:type="dxa" w:w="1474"/>
+            <w:tcW w:type="dxa" w:w="1928"/>
           </w:tcPr>
           <w:p>
             <w:pPr>
@@ -2128,25 +2339,7 @@
                 <w:b w:val="0"/>
                 <w:sz w:val="17"/>
               </w:rPr>
-              <w:t>内閣府（CaO）枠</w:t>
-            </w:r>
-          </w:p>
-        </w:tc>
-        <w:tc>
-          <w:tcPr>
-            <w:tcW w:type="dxa" w:w="3515"/>
-          </w:tcPr>
-          <w:p>
-            <w:pPr>
-              <w:spacing w:after="0" w:line="240" w:lineRule="auto"/>
-            </w:pPr>
-            <w:r/>
-            <w:r>
-              <w:rPr>
-                <w:b w:val="0"/>
-                <w:sz w:val="17"/>
-              </w:rPr>
-              <w:t>8/31「to be arranged with CAO」以降の記録なし。</w:t>
+              <w:t>前日設営に残る者</w:t>
             </w:r>
           </w:p>
         </w:tc>
@@ -2164,13 +2357,307 @@
                 <w:b w:val="0"/>
                 <w:sz w:val="17"/>
               </w:rPr>
-              <w:t>9/25 の連絡会で正式に依頼。持ち時間15分、締切（10/2・10/20）を伝える。</w:t>
+              <w:t>会場の前日利用可能時刻が未確認。</w:t>
             </w:r>
           </w:p>
         </w:tc>
         <w:tc>
           <w:tcPr>
-            <w:tcW w:type="dxa" w:w="1134"/>
+            <w:tcW w:type="dxa" w:w="2835"/>
+          </w:tcPr>
+          <w:p>
+            <w:pPr>
+              <w:spacing w:after="0" w:line="240" w:lineRule="auto"/>
+            </w:pPr>
+            <w:r/>
+            <w:r>
+              <w:rPr>
+                <w:b w:val="0"/>
+                <w:sz w:val="17"/>
+              </w:rPr>
+              <w:t>Sylvia 氏に確認後、公邸レセプションを外れる者を決める。</w:t>
+            </w:r>
+          </w:p>
+        </w:tc>
+        <w:tc>
+          <w:tcPr>
+            <w:tcW w:type="dxa" w:w="1247"/>
+          </w:tcPr>
+          <w:p>
+            <w:pPr>
+              <w:spacing w:after="0" w:line="240" w:lineRule="auto"/>
+            </w:pPr>
+            <w:r/>
+            <w:r>
+              <w:rPr>
+                <w:b w:val="0"/>
+                <w:sz w:val="17"/>
+              </w:rPr>
+              <w:t>荒木田</w:t>
+            </w:r>
+          </w:p>
+        </w:tc>
+      </w:tr>
+      <w:tr>
+        <w:tc>
+          <w:tcPr>
+            <w:tcW w:type="dxa" w:w="454"/>
+          </w:tcPr>
+          <w:p>
+            <w:pPr>
+              <w:spacing w:after="0" w:line="240" w:lineRule="auto"/>
+            </w:pPr>
+            <w:r/>
+            <w:r>
+              <w:rPr>
+                <w:b w:val="0"/>
+                <w:sz w:val="17"/>
+              </w:rPr>
+              <w:t>D</w:t>
+            </w:r>
+          </w:p>
+        </w:tc>
+        <w:tc>
+          <w:tcPr>
+            <w:tcW w:type="dxa" w:w="1928"/>
+          </w:tcPr>
+          <w:p>
+            <w:pPr>
+              <w:spacing w:after="0" w:line="240" w:lineRule="auto"/>
+            </w:pPr>
+            <w:r/>
+            <w:r>
+              <w:rPr>
+                <w:b w:val="0"/>
+                <w:sz w:val="17"/>
+              </w:rPr>
+              <w:t>AV 機材の削減</w:t>
+            </w:r>
+          </w:p>
+        </w:tc>
+        <w:tc>
+          <w:tcPr>
+            <w:tcW w:type="dxa" w:w="3061"/>
+          </w:tcPr>
+          <w:p>
+            <w:pPr>
+              <w:spacing w:after="0" w:line="240" w:lineRule="auto"/>
+            </w:pPr>
+            <w:r/>
+            <w:r>
+              <w:rPr>
+                <w:b w:val="0"/>
+                <w:sz w:val="17"/>
+              </w:rPr>
+              <w:t>9/24 に卓上マイク約22本の機材リストを送付済み。11:02 の打合せで削減案。</w:t>
+            </w:r>
+          </w:p>
+        </w:tc>
+        <w:tc>
+          <w:tcPr>
+            <w:tcW w:type="dxa" w:w="2835"/>
+          </w:tcPr>
+          <w:p>
+            <w:pPr>
+              <w:spacing w:after="0" w:line="240" w:lineRule="auto"/>
+            </w:pPr>
+            <w:r/>
+            <w:r>
+              <w:rPr>
+                <w:b w:val="0"/>
+                <w:sz w:val="17"/>
+              </w:rPr>
+              <w:t>見積を見てから修正案を出す。今は上限額を出さない。</w:t>
+            </w:r>
+          </w:p>
+        </w:tc>
+        <w:tc>
+          <w:tcPr>
+            <w:tcW w:type="dxa" w:w="1247"/>
+          </w:tcPr>
+          <w:p>
+            <w:pPr>
+              <w:spacing w:after="0" w:line="240" w:lineRule="auto"/>
+            </w:pPr>
+            <w:r/>
+            <w:r>
+              <w:rPr>
+                <w:b w:val="0"/>
+                <w:sz w:val="17"/>
+              </w:rPr>
+              <w:t>荒木田・児玉</w:t>
+            </w:r>
+          </w:p>
+        </w:tc>
+      </w:tr>
+      <w:tr>
+        <w:tc>
+          <w:tcPr>
+            <w:tcW w:type="dxa" w:w="454"/>
+          </w:tcPr>
+          <w:p>
+            <w:pPr>
+              <w:spacing w:after="0" w:line="240" w:lineRule="auto"/>
+            </w:pPr>
+            <w:r/>
+            <w:r>
+              <w:rPr>
+                <w:b w:val="0"/>
+                <w:sz w:val="17"/>
+              </w:rPr>
+              <w:t>E</w:t>
+            </w:r>
+          </w:p>
+        </w:tc>
+        <w:tc>
+          <w:tcPr>
+            <w:tcW w:type="dxa" w:w="1928"/>
+          </w:tcPr>
+          <w:p>
+            <w:pPr>
+              <w:spacing w:after="0" w:line="240" w:lineRule="auto"/>
+            </w:pPr>
+            <w:r/>
+            <w:r>
+              <w:rPr>
+                <w:b w:val="0"/>
+                <w:sz w:val="17"/>
+              </w:rPr>
+              <w:t>JAXA・内閣府民間2社の人選</w:t>
+            </w:r>
+          </w:p>
+        </w:tc>
+        <w:tc>
+          <w:tcPr>
+            <w:tcW w:type="dxa" w:w="3061"/>
+          </w:tcPr>
+          <w:p>
+            <w:pPr>
+              <w:spacing w:after="0" w:line="240" w:lineRule="auto"/>
+            </w:pPr>
+            <w:r/>
+            <w:r>
+              <w:rPr>
+                <w:b w:val="0"/>
+                <w:sz w:val="17"/>
+              </w:rPr>
+              <w:t>未確定。招待状は COSEM 署名が必要。</w:t>
+            </w:r>
+          </w:p>
+        </w:tc>
+        <w:tc>
+          <w:tcPr>
+            <w:tcW w:type="dxa" w:w="2835"/>
+          </w:tcPr>
+          <w:p>
+            <w:pPr>
+              <w:spacing w:after="0" w:line="240" w:lineRule="auto"/>
+            </w:pPr>
+            <w:r/>
+            <w:r>
+              <w:rPr>
+                <w:b w:val="0"/>
+                <w:sz w:val="17"/>
+              </w:rPr>
+              <w:t>確定次第、田中経由で COSEM 署名を取り発出。</w:t>
+            </w:r>
+          </w:p>
+        </w:tc>
+        <w:tc>
+          <w:tcPr>
+            <w:tcW w:type="dxa" w:w="1247"/>
+          </w:tcPr>
+          <w:p>
+            <w:pPr>
+              <w:spacing w:after="0" w:line="240" w:lineRule="auto"/>
+            </w:pPr>
+            <w:r/>
+            <w:r>
+              <w:rPr>
+                <w:b w:val="0"/>
+                <w:sz w:val="17"/>
+              </w:rPr>
+              <w:t>池田・児玉</w:t>
+            </w:r>
+          </w:p>
+        </w:tc>
+      </w:tr>
+      <w:tr>
+        <w:tc>
+          <w:tcPr>
+            <w:tcW w:type="dxa" w:w="454"/>
+          </w:tcPr>
+          <w:p>
+            <w:pPr>
+              <w:spacing w:after="0" w:line="240" w:lineRule="auto"/>
+            </w:pPr>
+            <w:r/>
+            <w:r>
+              <w:rPr>
+                <w:b w:val="0"/>
+                <w:sz w:val="17"/>
+              </w:rPr>
+              <w:t>F</w:t>
+            </w:r>
+          </w:p>
+        </w:tc>
+        <w:tc>
+          <w:tcPr>
+            <w:tcW w:type="dxa" w:w="1928"/>
+          </w:tcPr>
+          <w:p>
+            <w:pPr>
+              <w:spacing w:after="0" w:line="240" w:lineRule="auto"/>
+            </w:pPr>
+            <w:r/>
+            <w:r>
+              <w:rPr>
+                <w:b w:val="0"/>
+                <w:sz w:val="17"/>
+              </w:rPr>
+              <w:t>Gala への内閣府出席</w:t>
+            </w:r>
+          </w:p>
+        </w:tc>
+        <w:tc>
+          <w:tcPr>
+            <w:tcW w:type="dxa" w:w="3061"/>
+          </w:tcPr>
+          <w:p>
+            <w:pPr>
+              <w:spacing w:after="0" w:line="240" w:lineRule="auto"/>
+            </w:pPr>
+            <w:r/>
+            <w:r>
+              <w:rPr>
+                <w:b w:val="0"/>
+                <w:sz w:val="17"/>
+              </w:rPr>
+              <w:t>日本側の挨拶枠なしのため内閣府が検討中。</w:t>
+            </w:r>
+          </w:p>
+        </w:tc>
+        <w:tc>
+          <w:tcPr>
+            <w:tcW w:type="dxa" w:w="2835"/>
+          </w:tcPr>
+          <w:p>
+            <w:pPr>
+              <w:spacing w:after="0" w:line="240" w:lineRule="auto"/>
+            </w:pPr>
+            <w:r/>
+            <w:r>
+              <w:rPr>
+                <w:b w:val="0"/>
+                <w:sz w:val="17"/>
+              </w:rPr>
+              <w:t>本日の連絡会で確認。</w:t>
+            </w:r>
+          </w:p>
+        </w:tc>
+        <w:tc>
+          <w:tcPr>
+            <w:tcW w:type="dxa" w:w="1247"/>
           </w:tcPr>
           <w:p>
             <w:pPr>
@@ -2202,13 +2689,13 @@
                 <w:b w:val="0"/>
                 <w:sz w:val="17"/>
               </w:rPr>
-              <w:t>D</w:t>
+              <w:t>G</w:t>
             </w:r>
           </w:p>
         </w:tc>
         <w:tc>
           <w:tcPr>
-            <w:tcW w:type="dxa" w:w="1474"/>
+            <w:tcW w:type="dxa" w:w="1928"/>
           </w:tcPr>
           <w:p>
             <w:pPr>
@@ -2220,25 +2707,7 @@
                 <w:b w:val="0"/>
                 <w:sz w:val="17"/>
               </w:rPr>
-              <w:t>JAXA 枠</w:t>
-            </w:r>
-          </w:p>
-        </w:tc>
-        <w:tc>
-          <w:tcPr>
-            <w:tcW w:type="dxa" w:w="3515"/>
-          </w:tcPr>
-          <w:p>
-            <w:pPr>
-              <w:spacing w:after="0" w:line="240" w:lineRule="auto"/>
-            </w:pPr>
-            <w:r/>
-            <w:r>
-              <w:rPr>
-                <w:b w:val="0"/>
-                <w:sz w:val="17"/>
-              </w:rPr>
-              <w:t>2候補から選定中（9/18 週次）。自己負担。</w:t>
+              <w:t>内閣府の宿泊</w:t>
             </w:r>
           </w:p>
         </w:tc>
@@ -2256,13 +2725,13 @@
                 <w:b w:val="0"/>
                 <w:sz w:val="17"/>
               </w:rPr>
-              <w:t>氏名確定を 10/2 前に。CN 途中版の共有と同時に催促。</w:t>
+              <w:t>Dorsett 2室をキープ。追加要否の連絡なし。</w:t>
             </w:r>
           </w:p>
         </w:tc>
         <w:tc>
           <w:tcPr>
-            <w:tcW w:type="dxa" w:w="1134"/>
+            <w:tcW w:type="dxa" w:w="2835"/>
           </w:tcPr>
           <w:p>
             <w:pPr>
@@ -2274,455 +2743,13 @@
                 <w:b w:val="0"/>
                 <w:sz w:val="17"/>
               </w:rPr>
-              <w:t>池田</w:t>
-            </w:r>
-          </w:p>
-        </w:tc>
-      </w:tr>
-      <w:tr>
-        <w:tc>
-          <w:tcPr>
-            <w:tcW w:type="dxa" w:w="454"/>
-          </w:tcPr>
-          <w:p>
-            <w:pPr>
-              <w:spacing w:after="0" w:line="240" w:lineRule="auto"/>
-            </w:pPr>
-            <w:r/>
-            <w:r>
-              <w:rPr>
-                <w:b w:val="0"/>
-                <w:sz w:val="17"/>
-              </w:rPr>
-              <w:t>E</w:t>
+              <w:t>本日の連絡会で確認。</w:t>
             </w:r>
           </w:p>
         </w:tc>
         <w:tc>
           <w:tcPr>
-            <w:tcW w:type="dxa" w:w="1474"/>
-          </w:tcPr>
-          <w:p>
-            <w:pPr>
-              <w:spacing w:after="0" w:line="240" w:lineRule="auto"/>
-            </w:pPr>
-            <w:r/>
-            <w:r>
-              <w:rPr>
-                <w:b w:val="0"/>
-                <w:sz w:val="17"/>
-              </w:rPr>
-              <w:t>AV 費用の負担</w:t>
-            </w:r>
-          </w:p>
-        </w:tc>
-        <w:tc>
-          <w:tcPr>
-            <w:tcW w:type="dxa" w:w="3515"/>
-          </w:tcPr>
-          <w:p>
-            <w:pPr>
-              <w:spacing w:after="0" w:line="240" w:lineRule="auto"/>
-            </w:pPr>
-            <w:r/>
-            <w:r>
-              <w:rPr>
-                <w:b w:val="0"/>
-                <w:sz w:val="17"/>
-              </w:rPr>
-              <w:t>見積待ち。9/24 に機材リストを提示済み。</w:t>
-            </w:r>
-          </w:p>
-        </w:tc>
-        <w:tc>
-          <w:tcPr>
-            <w:tcW w:type="dxa" w:w="3061"/>
-          </w:tcPr>
-          <w:p>
-            <w:pPr>
-              <w:spacing w:after="0" w:line="240" w:lineRule="auto"/>
-            </w:pPr>
-            <w:r/>
-            <w:r>
-              <w:rPr>
-                <w:b w:val="0"/>
-                <w:sz w:val="17"/>
-              </w:rPr>
-              <w:t>ADRC が負担できる上限額を内々に決め、折半案の当否を判断。Webcam は持参で節約。</w:t>
-            </w:r>
-          </w:p>
-        </w:tc>
-        <w:tc>
-          <w:tcPr>
-            <w:tcW w:type="dxa" w:w="1134"/>
-          </w:tcPr>
-          <w:p>
-            <w:pPr>
-              <w:spacing w:after="0" w:line="240" w:lineRule="auto"/>
-            </w:pPr>
-            <w:r/>
-            <w:r>
-              <w:rPr>
-                <w:b w:val="0"/>
-                <w:sz w:val="17"/>
-              </w:rPr>
-              <w:t>児玉・藤中</w:t>
-            </w:r>
-          </w:p>
-        </w:tc>
-      </w:tr>
-      <w:tr>
-        <w:tc>
-          <w:tcPr>
-            <w:tcW w:type="dxa" w:w="454"/>
-          </w:tcPr>
-          <w:p>
-            <w:pPr>
-              <w:spacing w:after="0" w:line="240" w:lineRule="auto"/>
-            </w:pPr>
-            <w:r/>
-            <w:r>
-              <w:rPr>
-                <w:b w:val="0"/>
-                <w:sz w:val="17"/>
-              </w:rPr>
-              <w:t>F</w:t>
-            </w:r>
-          </w:p>
-        </w:tc>
-        <w:tc>
-          <w:tcPr>
-            <w:tcW w:type="dxa" w:w="1474"/>
-          </w:tcPr>
-          <w:p>
-            <w:pPr>
-              <w:spacing w:after="0" w:line="240" w:lineRule="auto"/>
-            </w:pPr>
-            <w:r/>
-            <w:r>
-              <w:rPr>
-                <w:b w:val="0"/>
-                <w:sz w:val="17"/>
-              </w:rPr>
-              <w:t>招待状の COSEM 署名</w:t>
-            </w:r>
-          </w:p>
-        </w:tc>
-        <w:tc>
-          <w:tcPr>
-            <w:tcW w:type="dxa" w:w="3515"/>
-          </w:tcPr>
-          <w:p>
-            <w:pPr>
-              <w:spacing w:after="0" w:line="240" w:lineRule="auto"/>
-            </w:pPr>
-            <w:r/>
-            <w:r>
-              <w:rPr>
-                <w:b w:val="0"/>
-                <w:sz w:val="17"/>
-              </w:rPr>
-              <w:t>田中の提案で、メンバー国レターと同じ COSEM 側の書式に改めることで合意（9/24 15:21）。三浦会長の署名後に田中が COSEM へ署名依頼。池田: 急ぎは BRIN と YI-Lab、Mizan がレターヘッド確認中。</w:t>
-            </w:r>
-          </w:p>
-        </w:tc>
-        <w:tc>
-          <w:tcPr>
-            <w:tcW w:type="dxa" w:w="3061"/>
-          </w:tcPr>
-          <w:p>
-            <w:pPr>
-              <w:spacing w:after="0" w:line="240" w:lineRule="auto"/>
-            </w:pPr>
-            <w:r/>
-            <w:r>
-              <w:rPr>
-                <w:b w:val="0"/>
-                <w:sz w:val="17"/>
-              </w:rPr>
-              <w:t>書式変更は田中、会長署名は池田が並行して準備。COSEM 側の署名者名は田中経由で確認。</w:t>
-            </w:r>
-          </w:p>
-        </w:tc>
-        <w:tc>
-          <w:tcPr>
-            <w:tcW w:type="dxa" w:w="1134"/>
-          </w:tcPr>
-          <w:p>
-            <w:pPr>
-              <w:spacing w:after="0" w:line="240" w:lineRule="auto"/>
-            </w:pPr>
-            <w:r/>
-            <w:r>
-              <w:rPr>
-                <w:b w:val="0"/>
-                <w:sz w:val="17"/>
-              </w:rPr>
-              <w:t>田中・池田</w:t>
-            </w:r>
-          </w:p>
-        </w:tc>
-      </w:tr>
-      <w:tr>
-        <w:tc>
-          <w:tcPr>
-            <w:tcW w:type="dxa" w:w="454"/>
-          </w:tcPr>
-          <w:p>
-            <w:pPr>
-              <w:spacing w:after="0" w:line="240" w:lineRule="auto"/>
-            </w:pPr>
-            <w:r/>
-            <w:r>
-              <w:rPr>
-                <w:b w:val="0"/>
-                <w:sz w:val="17"/>
-              </w:rPr>
-              <w:t>G</w:t>
-            </w:r>
-          </w:p>
-        </w:tc>
-        <w:tc>
-          <w:tcPr>
-            <w:tcW w:type="dxa" w:w="1474"/>
-          </w:tcPr>
-          <w:p>
-            <w:pPr>
-              <w:spacing w:after="0" w:line="240" w:lineRule="auto"/>
-            </w:pPr>
-            <w:r/>
-            <w:r>
-              <w:rPr>
-                <w:b w:val="0"/>
-                <w:sz w:val="17"/>
-              </w:rPr>
-              <w:t>バナーの文言にテーマを入れるか</w:t>
-            </w:r>
-          </w:p>
-        </w:tc>
-        <w:tc>
-          <w:tcPr>
-            <w:tcW w:type="dxa" w:w="3515"/>
-          </w:tcPr>
-          <w:p>
-            <w:pPr>
-              <w:spacing w:after="0" w:line="240" w:lineRule="auto"/>
-            </w:pPr>
-            <w:r/>
-            <w:r>
-              <w:rPr>
-                <w:b w:val="0"/>
-                <w:sz w:val="17"/>
-              </w:rPr>
-              <w:t>COSEM 案は大会名・会期・会場のみ。テーマの記載なし。</w:t>
-            </w:r>
-          </w:p>
-        </w:tc>
-        <w:tc>
-          <w:tcPr>
-            <w:tcW w:type="dxa" w:w="3061"/>
-          </w:tcPr>
-          <w:p>
-            <w:pPr>
-              <w:spacing w:after="0" w:line="240" w:lineRule="auto"/>
-            </w:pPr>
-            <w:r/>
-            <w:r>
-              <w:rPr>
-                <w:b w:val="0"/>
-                <w:sz w:val="17"/>
-              </w:rPr>
-              <w:t>現案のまま（テーマなし）で進める。入れるなら修正依頼と同時に伝える。</w:t>
-            </w:r>
-          </w:p>
-        </w:tc>
-        <w:tc>
-          <w:tcPr>
-            <w:tcW w:type="dxa" w:w="1134"/>
-          </w:tcPr>
-          <w:p>
-            <w:pPr>
-              <w:spacing w:after="0" w:line="240" w:lineRule="auto"/>
-            </w:pPr>
-            <w:r/>
-            <w:r>
-              <w:rPr>
-                <w:b w:val="0"/>
-                <w:sz w:val="17"/>
-              </w:rPr>
-              <w:t>荒木田・藤本</w:t>
-            </w:r>
-          </w:p>
-        </w:tc>
-      </w:tr>
-      <w:tr>
-        <w:tc>
-          <w:tcPr>
-            <w:tcW w:type="dxa" w:w="454"/>
-          </w:tcPr>
-          <w:p>
-            <w:pPr>
-              <w:spacing w:after="0" w:line="240" w:lineRule="auto"/>
-            </w:pPr>
-            <w:r/>
-            <w:r>
-              <w:rPr>
-                <w:b w:val="0"/>
-                <w:sz w:val="17"/>
-              </w:rPr>
-              <w:t>H</w:t>
-            </w:r>
-          </w:p>
-        </w:tc>
-        <w:tc>
-          <w:tcPr>
-            <w:tcW w:type="dxa" w:w="1474"/>
-          </w:tcPr>
-          <w:p>
-            <w:pPr>
-              <w:spacing w:after="0" w:line="240" w:lineRule="auto"/>
-            </w:pPr>
-            <w:r/>
-            <w:r>
-              <w:rPr>
-                <w:b w:val="0"/>
-                <w:sz w:val="17"/>
-              </w:rPr>
-              <w:t>登録フォームの "+"</w:t>
-            </w:r>
-          </w:p>
-        </w:tc>
-        <w:tc>
-          <w:tcPr>
-            <w:tcW w:type="dxa" w:w="3515"/>
-          </w:tcPr>
-          <w:p>
-            <w:pPr>
-              <w:spacing w:after="0" w:line="240" w:lineRule="auto"/>
-            </w:pPr>
-            <w:r/>
-            <w:r>
-              <w:rPr>
-                <w:b w:val="0"/>
-                <w:sz w:val="17"/>
-              </w:rPr>
-              <w:t>国番号欄が "+" を弾く。海外登録者全員が同じエラーに当たる。</w:t>
-            </w:r>
-          </w:p>
-        </w:tc>
-        <w:tc>
-          <w:tcPr>
-            <w:tcW w:type="dxa" w:w="3061"/>
-          </w:tcPr>
-          <w:p>
-            <w:pPr>
-              <w:spacing w:after="0" w:line="240" w:lineRule="auto"/>
-            </w:pPr>
-            <w:r/>
-            <w:r>
-              <w:rPr>
-                <w:b w:val="0"/>
-                <w:sz w:val="17"/>
-              </w:rPr>
-              <w:t>欄のヒントに "without +" を追加。</w:t>
-            </w:r>
-          </w:p>
-        </w:tc>
-        <w:tc>
-          <w:tcPr>
-            <w:tcW w:type="dxa" w:w="1134"/>
-          </w:tcPr>
-          <w:p>
-            <w:pPr>
-              <w:spacing w:after="0" w:line="240" w:lineRule="auto"/>
-            </w:pPr>
-            <w:r/>
-            <w:r>
-              <w:rPr>
-                <w:b w:val="0"/>
-                <w:sz w:val="17"/>
-              </w:rPr>
-              <w:t>藤本</w:t>
-            </w:r>
-          </w:p>
-        </w:tc>
-      </w:tr>
-      <w:tr>
-        <w:tc>
-          <w:tcPr>
-            <w:tcW w:type="dxa" w:w="454"/>
-          </w:tcPr>
-          <w:p>
-            <w:pPr>
-              <w:spacing w:after="0" w:line="240" w:lineRule="auto"/>
-            </w:pPr>
-            <w:r/>
-            <w:r>
-              <w:rPr>
-                <w:b w:val="0"/>
-                <w:sz w:val="17"/>
-              </w:rPr>
-              <w:t>I</w:t>
-            </w:r>
-          </w:p>
-        </w:tc>
-        <w:tc>
-          <w:tcPr>
-            <w:tcW w:type="dxa" w:w="1474"/>
-          </w:tcPr>
-          <w:p>
-            <w:pPr>
-              <w:spacing w:after="0" w:line="240" w:lineRule="auto"/>
-            </w:pPr>
-            <w:r/>
-            <w:r>
-              <w:rPr>
-                <w:b w:val="0"/>
-                <w:sz w:val="17"/>
-              </w:rPr>
-              <w:t>SJ60 レセプションと SIDEX スピーカーディナーの重複</w:t>
-            </w:r>
-          </w:p>
-        </w:tc>
-        <w:tc>
-          <w:tcPr>
-            <w:tcW w:type="dxa" w:w="3515"/>
-          </w:tcPr>
-          <w:p>
-            <w:pPr>
-              <w:spacing w:after="0" w:line="240" w:lineRule="auto"/>
-            </w:pPr>
-            <w:r/>
-            <w:r>
-              <w:rPr>
-                <w:b w:val="0"/>
-                <w:sz w:val="17"/>
-              </w:rPr>
-              <w:t>Nishikawa 氏、Dave Gawn 氏（NZ）、AUS NEMA、Comr が同日同時刻に両方の対象。</w:t>
-            </w:r>
-          </w:p>
-        </w:tc>
-        <w:tc>
-          <w:tcPr>
-            <w:tcW w:type="dxa" w:w="3061"/>
-          </w:tcPr>
-          <w:p>
-            <w:pPr>
-              <w:spacing w:after="0" w:line="240" w:lineRule="auto"/>
-            </w:pPr>
-            <w:r/>
-            <w:r>
-              <w:rPr>
-                <w:b w:val="0"/>
-                <w:sz w:val="17"/>
-              </w:rPr>
-              <w:t>本人選択とし、大使館名簿（9/27 頃）に反映。</w:t>
-            </w:r>
-          </w:p>
-        </w:tc>
-        <w:tc>
-          <w:tcPr>
-            <w:tcW w:type="dxa" w:w="1134"/>
+            <w:tcW w:type="dxa" w:w="1247"/>
           </w:tcPr>
           <w:p>
             <w:pPr>
@@ -2735,98 +2762,6 @@
                 <w:sz w:val="17"/>
               </w:rPr>
               <w:t>児玉</w:t>
-            </w:r>
-          </w:p>
-        </w:tc>
-      </w:tr>
-      <w:tr>
-        <w:tc>
-          <w:tcPr>
-            <w:tcW w:type="dxa" w:w="454"/>
-          </w:tcPr>
-          <w:p>
-            <w:pPr>
-              <w:spacing w:after="0" w:line="240" w:lineRule="auto"/>
-            </w:pPr>
-            <w:r/>
-            <w:r>
-              <w:rPr>
-                <w:b w:val="0"/>
-                <w:sz w:val="17"/>
-              </w:rPr>
-              <w:t>J</w:t>
-            </w:r>
-          </w:p>
-        </w:tc>
-        <w:tc>
-          <w:tcPr>
-            <w:tcW w:type="dxa" w:w="1474"/>
-          </w:tcPr>
-          <w:p>
-            <w:pPr>
-              <w:spacing w:after="0" w:line="240" w:lineRule="auto"/>
-            </w:pPr>
-            <w:r/>
-            <w:r>
-              <w:rPr>
-                <w:b w:val="0"/>
-                <w:sz w:val="17"/>
-              </w:rPr>
-              <w:t>韓国の人数</w:t>
-            </w:r>
-          </w:p>
-        </w:tc>
-        <w:tc>
-          <w:tcPr>
-            <w:tcW w:type="dxa" w:w="3515"/>
-          </w:tcPr>
-          <w:p>
-            <w:pPr>
-              <w:spacing w:after="0" w:line="240" w:lineRule="auto"/>
-            </w:pPr>
-            <w:r/>
-            <w:r>
-              <w:rPr>
-                <w:b w:val="0"/>
-                <w:sz w:val="17"/>
-              </w:rPr>
-              <w:t>9/21 に3名登録（MOIS）。8/28 リストの So 氏を含めると4名か、差替えか不明。</w:t>
-            </w:r>
-          </w:p>
-        </w:tc>
-        <w:tc>
-          <w:tcPr>
-            <w:tcW w:type="dxa" w:w="3061"/>
-          </w:tcPr>
-          <w:p>
-            <w:pPr>
-              <w:spacing w:after="0" w:line="240" w:lineRule="auto"/>
-            </w:pPr>
-            <w:r/>
-            <w:r>
-              <w:rPr>
-                <w:b w:val="0"/>
-                <w:sz w:val="17"/>
-              </w:rPr>
-              <w:t>名簿で確認し、Dorsett の D/DS 区分を整理。</w:t>
-            </w:r>
-          </w:p>
-        </w:tc>
-        <w:tc>
-          <w:tcPr>
-            <w:tcW w:type="dxa" w:w="1134"/>
-          </w:tcPr>
-          <w:p>
-            <w:pPr>
-              <w:spacing w:after="0" w:line="240" w:lineRule="auto"/>
-            </w:pPr>
-            <w:r/>
-            <w:r>
-              <w:rPr>
-                <w:b w:val="0"/>
-                <w:sz w:val="17"/>
-              </w:rPr>
-              <w:t>田中</w:t>
             </w:r>
           </w:p>
         </w:tc>
@@ -2851,7 +2786,7 @@
           <w:color w:val="1F3864"/>
           <w:sz w:val="24"/>
         </w:rPr>
-        <w:t>4. 対外の待ち・未回答</w:t>
+        <w:t>5. 対外の発信予定</w:t>
       </w:r>
     </w:p>
     <w:tbl>
@@ -2863,15 +2798,14 @@
         <w:tblLook w:firstColumn="1" w:firstRow="1" w:lastColumn="0" w:lastRow="0" w:noHBand="0" w:noVBand="1" w:val="04A0"/>
       </w:tblPr>
       <w:tblGrid>
-        <w:gridCol w:w="1361"/>
-        <w:gridCol w:w="3742"/>
         <w:gridCol w:w="2041"/>
-        <w:gridCol w:w="2721"/>
+        <w:gridCol w:w="5443"/>
+        <w:gridCol w:w="2381"/>
       </w:tblGrid>
       <w:tr>
         <w:tc>
           <w:tcPr>
-            <w:tcW w:type="dxa" w:w="1361"/>
+            <w:tcW w:type="dxa" w:w="2041"/>
             <w:shd w:val="clear" w:color="auto" w:fill="1F3864"/>
           </w:tcPr>
           <w:p>
@@ -2891,7 +2825,7 @@
         </w:tc>
         <w:tc>
           <w:tcPr>
-            <w:tcW w:type="dxa" w:w="3742"/>
+            <w:tcW w:type="dxa" w:w="5443"/>
             <w:shd w:val="clear" w:color="auto" w:fill="1F3864"/>
           </w:tcPr>
           <w:p>
@@ -2911,7 +2845,7 @@
         </w:tc>
         <w:tc>
           <w:tcPr>
-            <w:tcW w:type="dxa" w:w="2041"/>
+            <w:tcW w:type="dxa" w:w="2381"/>
             <w:shd w:val="clear" w:color="auto" w:fill="1F3864"/>
           </w:tcPr>
           <w:p>
@@ -2925,68 +2859,12 @@
                 <w:color w:val="FFFFFF"/>
                 <w:sz w:val="17"/>
               </w:rPr>
-              <w:t>経過</w:t>
-            </w:r>
-          </w:p>
-        </w:tc>
-        <w:tc>
-          <w:tcPr>
-            <w:tcW w:type="dxa" w:w="2721"/>
-            <w:shd w:val="clear" w:color="auto" w:fill="1F3864"/>
-          </w:tcPr>
-          <w:p>
-            <w:pPr>
-              <w:spacing w:after="0" w:line="240" w:lineRule="auto"/>
-            </w:pPr>
-            <w:r/>
-            <w:r>
-              <w:rPr>
-                <w:b/>
-                <w:color w:val="FFFFFF"/>
-                <w:sz w:val="17"/>
-              </w:rPr>
-              <w:t>次の一手</w:t>
+              <w:t>時期</w:t>
             </w:r>
           </w:p>
         </w:tc>
       </w:tr>
       <w:tr>
-        <w:tc>
-          <w:tcPr>
-            <w:tcW w:type="dxa" w:w="1361"/>
-          </w:tcPr>
-          <w:p>
-            <w:pPr>
-              <w:spacing w:after="0" w:line="240" w:lineRule="auto"/>
-            </w:pPr>
-            <w:r/>
-            <w:r>
-              <w:rPr>
-                <w:b w:val="0"/>
-                <w:sz w:val="17"/>
-              </w:rPr>
-              <w:t>Sylvia</w:t>
-            </w:r>
-          </w:p>
-        </w:tc>
-        <w:tc>
-          <w:tcPr>
-            <w:tcW w:type="dxa" w:w="3742"/>
-          </w:tcPr>
-          <w:p>
-            <w:pPr>
-              <w:spacing w:after="0" w:line="240" w:lineRule="auto"/>
-            </w:pPr>
-            <w:r/>
-            <w:r>
-              <w:rPr>
-                <w:b w:val="0"/>
-                <w:sz w:val="17"/>
-              </w:rPr>
-              <w:t>U 字28席案の EXPO 作図、AV 見積、バナー修正版・寸法、07:30 入室、フィールドトリップの服装、SG 側署名者</w:t>
-            </w:r>
-          </w:p>
-        </w:tc>
         <w:tc>
           <w:tcPr>
             <w:tcW w:type="dxa" w:w="2041"/>
@@ -3001,13 +2879,13 @@
                 <w:b w:val="0"/>
                 <w:sz w:val="17"/>
               </w:rPr>
-              <w:t>9/24 送付・回答</w:t>
+              <w:t>Sylvia（WhatsApp）</w:t>
             </w:r>
           </w:p>
         </w:tc>
         <w:tc>
           <w:tcPr>
-            <w:tcW w:type="dxa" w:w="2721"/>
+            <w:tcW w:type="dxa" w:w="5443"/>
           </w:tcPr>
           <w:p>
             <w:pPr>
@@ -3019,15 +2897,13 @@
                 <w:b w:val="0"/>
                 <w:sz w:val="17"/>
               </w:rPr>
-              <w:t>10/1 合同会議前に一度まとめて確認</w:t>
+              <w:t>日本パビリオンの回答（連絡会後）、合同会議 9/29 午前への変更了承</w:t>
             </w:r>
           </w:p>
         </w:tc>
-      </w:tr>
-      <w:tr>
         <w:tc>
           <w:tcPr>
-            <w:tcW w:type="dxa" w:w="1361"/>
+            <w:tcW w:type="dxa" w:w="2381"/>
           </w:tcPr>
           <w:p>
             <w:pPr>
@@ -3039,28 +2915,12 @@
                 <w:b w:val="0"/>
                 <w:sz w:val="17"/>
               </w:rPr>
-              <w:t>ウズベキスタン</w:t>
+              <w:t>本日</w:t>
             </w:r>
           </w:p>
         </w:tc>
-        <w:tc>
-          <w:tcPr>
-            <w:tcW w:type="dxa" w:w="3742"/>
-          </w:tcPr>
-          <w:p>
-            <w:pPr>
-              <w:spacing w:after="0" w:line="240" w:lineRule="auto"/>
-            </w:pPr>
-            <w:r/>
-            <w:r>
-              <w:rPr>
-                <w:b w:val="0"/>
-                <w:sz w:val="17"/>
-              </w:rPr>
-              <w:t>2名の選出と登録</w:t>
-            </w:r>
-          </w:p>
-        </w:tc>
+      </w:tr>
+      <w:tr>
         <w:tc>
           <w:tcPr>
             <w:tcW w:type="dxa" w:w="2041"/>
@@ -3075,13 +2935,13 @@
                 <w:b w:val="0"/>
                 <w:sz w:val="17"/>
               </w:rPr>
-              <w:t>9/24 連絡が取れた。事務局が案内メールを再送</w:t>
+              <w:t>Sylvia（メール）</w:t>
             </w:r>
           </w:p>
         </w:tc>
         <w:tc>
           <w:tcPr>
-            <w:tcW w:type="dxa" w:w="2721"/>
+            <w:tcW w:type="dxa" w:w="5443"/>
           </w:tcPr>
           <w:p>
             <w:pPr>
@@ -3093,15 +2953,13 @@
                 <w:b w:val="0"/>
                 <w:sz w:val="17"/>
               </w:rPr>
-              <w:t>登録後にビザ書類と登壇者名</w:t>
+              <w:t>バナー修正版の承認（下書き済み）＋期間表記 27-30 への訂正依頼</w:t>
             </w:r>
           </w:p>
         </w:tc>
-      </w:tr>
-      <w:tr>
         <w:tc>
           <w:tcPr>
-            <w:tcW w:type="dxa" w:w="1361"/>
+            <w:tcW w:type="dxa" w:w="2381"/>
           </w:tcPr>
           <w:p>
             <w:pPr>
@@ -3113,28 +2971,12 @@
                 <w:b w:val="0"/>
                 <w:sz w:val="17"/>
               </w:rPr>
-              <w:t>タジキスタン</w:t>
+              <w:t>本日</w:t>
             </w:r>
           </w:p>
         </w:tc>
-        <w:tc>
-          <w:tcPr>
-            <w:tcW w:type="dxa" w:w="3742"/>
-          </w:tcPr>
-          <w:p>
-            <w:pPr>
-              <w:spacing w:after="0" w:line="240" w:lineRule="auto"/>
-            </w:pPr>
-            <w:r/>
-            <w:r>
-              <w:rPr>
-                <w:b w:val="0"/>
-                <w:sz w:val="17"/>
-              </w:rPr>
-              <w:t>参加登録</w:t>
-            </w:r>
-          </w:p>
-        </w:tc>
+      </w:tr>
+      <w:tr>
         <w:tc>
           <w:tcPr>
             <w:tcW w:type="dxa" w:w="2041"/>
@@ -3149,13 +2991,13 @@
                 <w:b w:val="0"/>
                 <w:sz w:val="17"/>
               </w:rPr>
-              <w:t>9/24 WhatsApp 再リマインド</w:t>
+              <w:t>COSEM（9/29 合同会議）</w:t>
             </w:r>
           </w:p>
         </w:tc>
         <w:tc>
           <w:tcPr>
-            <w:tcW w:type="dxa" w:w="2721"/>
+            <w:tcW w:type="dxa" w:w="5443"/>
           </w:tcPr>
           <w:p>
             <w:pPr>
@@ -3167,7 +3009,25 @@
                 <w:b w:val="0"/>
                 <w:sz w:val="17"/>
               </w:rPr>
-              <w:t>回答待ち。ビザ要</w:t>
+              <w:t>RT 分割案、3人目以降のランチ・Gala・パスの割当振替、Dorsett 増枠、AV 見積と支払方法、前日設営時刻、07:30 入室</w:t>
+            </w:r>
+          </w:p>
+        </w:tc>
+        <w:tc>
+          <w:tcPr>
+            <w:tcW w:type="dxa" w:w="2381"/>
+          </w:tcPr>
+          <w:p>
+            <w:pPr>
+              <w:spacing w:after="0" w:line="240" w:lineRule="auto"/>
+            </w:pPr>
+            <w:r/>
+            <w:r>
+              <w:rPr>
+                <w:b w:val="0"/>
+                <w:sz w:val="17"/>
+              </w:rPr>
+              <w:t>9/29</w:t>
             </w:r>
           </w:p>
         </w:tc>
@@ -3175,7 +3035,7 @@
       <w:tr>
         <w:tc>
           <w:tcPr>
-            <w:tcW w:type="dxa" w:w="1361"/>
+            <w:tcW w:type="dxa" w:w="2041"/>
           </w:tcPr>
           <w:p>
             <w:pPr>
@@ -3193,7 +3053,7 @@
         </w:tc>
         <w:tc>
           <w:tcPr>
-            <w:tcW w:type="dxa" w:w="3742"/>
+            <w:tcW w:type="dxa" w:w="5443"/>
           </w:tcPr>
           <w:p>
             <w:pPr>
@@ -3205,10 +3065,30 @@
                 <w:b w:val="0"/>
                 <w:sz w:val="17"/>
               </w:rPr>
-              <w:t>質疑時間の一行訂正（約30分 → 質疑とまとめで約25分、当日調整）</w:t>
+              <w:t>質疑時間の一行訂正</w:t>
             </w:r>
           </w:p>
         </w:tc>
+        <w:tc>
+          <w:tcPr>
+            <w:tcW w:type="dxa" w:w="2381"/>
+          </w:tcPr>
+          <w:p>
+            <w:pPr>
+              <w:spacing w:after="0" w:line="240" w:lineRule="auto"/>
+            </w:pPr>
+            <w:r/>
+            <w:r>
+              <w:rPr>
+                <w:b w:val="0"/>
+                <w:sz w:val="17"/>
+              </w:rPr>
+              <w:t>次の連絡で</w:t>
+            </w:r>
+          </w:p>
+        </w:tc>
+      </w:tr>
+      <w:tr>
         <w:tc>
           <w:tcPr>
             <w:tcW w:type="dxa" w:w="2041"/>
@@ -3223,13 +3103,13 @@
                 <w:b w:val="0"/>
                 <w:sz w:val="17"/>
               </w:rPr>
-              <w:t>池田了承 9/24</w:t>
+              <w:t>田中</w:t>
             </w:r>
           </w:p>
         </w:tc>
         <w:tc>
           <w:tcPr>
-            <w:tcW w:type="dxa" w:w="2721"/>
+            <w:tcW w:type="dxa" w:w="5443"/>
           </w:tcPr>
           <w:p>
             <w:pPr>
@@ -3241,15 +3121,13 @@
                 <w:b w:val="0"/>
                 <w:sz w:val="17"/>
               </w:rPr>
-              <w:t>荒木田から次の連絡で</w:t>
+              <w:t>Letter of undertaking の共有、ウズベキスタン登録後のビザ書類</w:t>
             </w:r>
           </w:p>
         </w:tc>
-      </w:tr>
-      <w:tr>
         <w:tc>
           <w:tcPr>
-            <w:tcW w:type="dxa" w:w="1361"/>
+            <w:tcW w:type="dxa" w:w="2381"/>
           </w:tcPr>
           <w:p>
             <w:pPr>
@@ -3261,283 +3139,7 @@
                 <w:b w:val="0"/>
                 <w:sz w:val="17"/>
               </w:rPr>
-              <w:t>BRIN</w:t>
-            </w:r>
-          </w:p>
-        </w:tc>
-        <w:tc>
-          <w:tcPr>
-            <w:tcW w:type="dxa" w:w="3742"/>
-          </w:tcPr>
-          <w:p>
-            <w:pPr>
-              <w:spacing w:after="0" w:line="240" w:lineRule="auto"/>
-            </w:pPr>
-            <w:r/>
-            <w:r>
-              <w:rPr>
-                <w:b w:val="0"/>
-                <w:sz w:val="17"/>
-              </w:rPr>
-              <w:t>復路便の希望</w:t>
-            </w:r>
-          </w:p>
-        </w:tc>
-        <w:tc>
-          <w:tcPr>
-            <w:tcW w:type="dxa" w:w="2041"/>
-          </w:tcPr>
-          <w:p>
-            <w:pPr>
-              <w:spacing w:after="0" w:line="240" w:lineRule="auto"/>
-            </w:pPr>
-            <w:r/>
-            <w:r>
-              <w:rPr>
-                <w:b w:val="0"/>
-                <w:sz w:val="17"/>
-              </w:rPr>
-              <w:t>Mizan 経由で照会中（9/18）</w:t>
-            </w:r>
-          </w:p>
-        </w:tc>
-        <w:tc>
-          <w:tcPr>
-            <w:tcW w:type="dxa" w:w="2721"/>
-          </w:tcPr>
-          <w:p>
-            <w:pPr>
-              <w:spacing w:after="0" w:line="240" w:lineRule="auto"/>
-            </w:pPr>
-            <w:r/>
-            <w:r>
-              <w:rPr>
-                <w:b w:val="0"/>
-                <w:sz w:val="17"/>
-              </w:rPr>
-              <w:t>藤本が発券</w:t>
-            </w:r>
-          </w:p>
-        </w:tc>
-      </w:tr>
-      <w:tr>
-        <w:tc>
-          <w:tcPr>
-            <w:tcW w:type="dxa" w:w="1361"/>
-          </w:tcPr>
-          <w:p>
-            <w:pPr>
-              <w:spacing w:after="0" w:line="240" w:lineRule="auto"/>
-            </w:pPr>
-            <w:r/>
-            <w:r>
-              <w:rPr>
-                <w:b w:val="0"/>
-                <w:sz w:val="17"/>
-              </w:rPr>
-              <w:t>タイ DDPM</w:t>
-            </w:r>
-          </w:p>
-        </w:tc>
-        <w:tc>
-          <w:tcPr>
-            <w:tcW w:type="dxa" w:w="3742"/>
-          </w:tcPr>
-          <w:p>
-            <w:pPr>
-              <w:spacing w:after="0" w:line="240" w:lineRule="auto"/>
-            </w:pPr>
-            <w:r/>
-            <w:r>
-              <w:rPr>
-                <w:b w:val="0"/>
-                <w:sz w:val="17"/>
-              </w:rPr>
-              <w:t>Prasong 氏の正式登録</w:t>
-            </w:r>
-          </w:p>
-        </w:tc>
-        <w:tc>
-          <w:tcPr>
-            <w:tcW w:type="dxa" w:w="2041"/>
-          </w:tcPr>
-          <w:p>
-            <w:pPr>
-              <w:spacing w:after="0" w:line="240" w:lineRule="auto"/>
-            </w:pPr>
-            <w:r/>
-            <w:r>
-              <w:rPr>
-                <w:b w:val="0"/>
-                <w:sz w:val="17"/>
-              </w:rPr>
-              <w:t>9/22 指名予定の連絡</w:t>
-            </w:r>
-          </w:p>
-        </w:tc>
-        <w:tc>
-          <w:tcPr>
-            <w:tcW w:type="dxa" w:w="2721"/>
-          </w:tcPr>
-          <w:p>
-            <w:pPr>
-              <w:spacing w:after="0" w:line="240" w:lineRule="auto"/>
-            </w:pPr>
-            <w:r/>
-            <w:r>
-              <w:rPr>
-                <w:b w:val="0"/>
-                <w:sz w:val="17"/>
-              </w:rPr>
-              <w:t>登録フォームへの入力を待つ</w:t>
-            </w:r>
-          </w:p>
-        </w:tc>
-      </w:tr>
-      <w:tr>
-        <w:tc>
-          <w:tcPr>
-            <w:tcW w:type="dxa" w:w="1361"/>
-          </w:tcPr>
-          <w:p>
-            <w:pPr>
-              <w:spacing w:after="0" w:line="240" w:lineRule="auto"/>
-            </w:pPr>
-            <w:r/>
-            <w:r>
-              <w:rPr>
-                <w:b w:val="0"/>
-                <w:sz w:val="17"/>
-              </w:rPr>
-              <w:t>インド</w:t>
-            </w:r>
-          </w:p>
-        </w:tc>
-        <w:tc>
-          <w:tcPr>
-            <w:tcW w:type="dxa" w:w="3742"/>
-          </w:tcPr>
-          <w:p>
-            <w:pPr>
-              <w:spacing w:after="0" w:line="240" w:lineRule="auto"/>
-            </w:pPr>
-            <w:r/>
-            <w:r>
-              <w:rPr>
-                <w:b w:val="0"/>
-                <w:sz w:val="17"/>
-              </w:rPr>
-              <w:t>最終承認と旅券</w:t>
-            </w:r>
-          </w:p>
-        </w:tc>
-        <w:tc>
-          <w:tcPr>
-            <w:tcW w:type="dxa" w:w="2041"/>
-          </w:tcPr>
-          <w:p>
-            <w:pPr>
-              <w:spacing w:after="0" w:line="240" w:lineRule="auto"/>
-            </w:pPr>
-            <w:r/>
-            <w:r>
-              <w:rPr>
-                <w:b w:val="0"/>
-                <w:sz w:val="17"/>
-              </w:rPr>
-              <w:t>9/17〜</w:t>
-            </w:r>
-          </w:p>
-        </w:tc>
-        <w:tc>
-          <w:tcPr>
-            <w:tcW w:type="dxa" w:w="2721"/>
-          </w:tcPr>
-          <w:p>
-            <w:pPr>
-              <w:spacing w:after="0" w:line="240" w:lineRule="auto"/>
-            </w:pPr>
-            <w:r/>
-            <w:r>
-              <w:rPr>
-                <w:b w:val="0"/>
-                <w:sz w:val="17"/>
-              </w:rPr>
-              <w:t>旅券到着後に発券</w:t>
-            </w:r>
-          </w:p>
-        </w:tc>
-      </w:tr>
-      <w:tr>
-        <w:tc>
-          <w:tcPr>
-            <w:tcW w:type="dxa" w:w="1361"/>
-          </w:tcPr>
-          <w:p>
-            <w:pPr>
-              <w:spacing w:after="0" w:line="240" w:lineRule="auto"/>
-            </w:pPr>
-            <w:r/>
-            <w:r>
-              <w:rPr>
-                <w:b w:val="0"/>
-                <w:sz w:val="17"/>
-              </w:rPr>
-              <w:t>内閣府</w:t>
-            </w:r>
-          </w:p>
-        </w:tc>
-        <w:tc>
-          <w:tcPr>
-            <w:tcW w:type="dxa" w:w="3742"/>
-          </w:tcPr>
-          <w:p>
-            <w:pPr>
-              <w:spacing w:after="0" w:line="240" w:lineRule="auto"/>
-            </w:pPr>
-            <w:r/>
-            <w:r>
-              <w:rPr>
-                <w:b w:val="0"/>
-                <w:sz w:val="17"/>
-              </w:rPr>
-              <w:t>CaO 登壇者、日本パビリオンの所要時間</w:t>
-            </w:r>
-          </w:p>
-        </w:tc>
-        <w:tc>
-          <w:tcPr>
-            <w:tcW w:type="dxa" w:w="2041"/>
-          </w:tcPr>
-          <w:p>
-            <w:pPr>
-              <w:spacing w:after="0" w:line="240" w:lineRule="auto"/>
-            </w:pPr>
-            <w:r/>
-            <w:r>
-              <w:rPr>
-                <w:b w:val="0"/>
-                <w:sz w:val="17"/>
-              </w:rPr>
-              <w:t>8/31〜</w:t>
-            </w:r>
-          </w:p>
-        </w:tc>
-        <w:tc>
-          <w:tcPr>
-            <w:tcW w:type="dxa" w:w="2721"/>
-          </w:tcPr>
-          <w:p>
-            <w:pPr>
-              <w:spacing w:after="0" w:line="240" w:lineRule="auto"/>
-            </w:pPr>
-            <w:r/>
-            <w:r>
-              <w:rPr>
-                <w:b w:val="0"/>
-                <w:sz w:val="17"/>
-              </w:rPr>
-              <w:t>9/25 連絡会</w:t>
+              <w:t>登録後</w:t>
             </w:r>
           </w:p>
         </w:tc>
@@ -3562,496 +3164,7 @@
           <w:color w:val="1F3864"/>
           <w:sz w:val="24"/>
         </w:rPr>
-        <w:t>5. 発信済みと残る発信</w:t>
-      </w:r>
-    </w:p>
-    <w:tbl>
-      <w:tblPr>
-        <w:tblStyle w:val="TableGrid"/>
-        <w:tblW w:type="auto" w:w="0"/>
-        <w:jc w:val="center"/>
-        <w:tblLayout w:type="fixed"/>
-        <w:tblLook w:firstColumn="1" w:firstRow="1" w:lastColumn="0" w:lastRow="0" w:noHBand="0" w:noVBand="1" w:val="04A0"/>
-      </w:tblPr>
-      <w:tblGrid>
-        <w:gridCol w:w="1814"/>
-        <w:gridCol w:w="3628"/>
-        <w:gridCol w:w="1928"/>
-        <w:gridCol w:w="2494"/>
-      </w:tblGrid>
-      <w:tr>
-        <w:tc>
-          <w:tcPr>
-            <w:tcW w:type="dxa" w:w="1814"/>
-            <w:shd w:val="clear" w:color="auto" w:fill="1F3864"/>
-          </w:tcPr>
-          <w:p>
-            <w:pPr>
-              <w:spacing w:after="0" w:line="240" w:lineRule="auto"/>
-            </w:pPr>
-            <w:r/>
-            <w:r>
-              <w:rPr>
-                <w:b/>
-                <w:color w:val="FFFFFF"/>
-                <w:sz w:val="17"/>
-              </w:rPr>
-              <w:t>宛先</w:t>
-            </w:r>
-          </w:p>
-        </w:tc>
-        <w:tc>
-          <w:tcPr>
-            <w:tcW w:type="dxa" w:w="3628"/>
-            <w:shd w:val="clear" w:color="auto" w:fill="1F3864"/>
-          </w:tcPr>
-          <w:p>
-            <w:pPr>
-              <w:spacing w:after="0" w:line="240" w:lineRule="auto"/>
-            </w:pPr>
-            <w:r/>
-            <w:r>
-              <w:rPr>
-                <w:b/>
-                <w:color w:val="FFFFFF"/>
-                <w:sz w:val="17"/>
-              </w:rPr>
-              <w:t>件名・内容</w:t>
-            </w:r>
-          </w:p>
-        </w:tc>
-        <w:tc>
-          <w:tcPr>
-            <w:tcW w:type="dxa" w:w="1928"/>
-            <w:shd w:val="clear" w:color="auto" w:fill="1F3864"/>
-          </w:tcPr>
-          <w:p>
-            <w:pPr>
-              <w:spacing w:after="0" w:line="240" w:lineRule="auto"/>
-            </w:pPr>
-            <w:r/>
-            <w:r>
-              <w:rPr>
-                <w:b/>
-                <w:color w:val="FFFFFF"/>
-                <w:sz w:val="17"/>
-              </w:rPr>
-              <w:t>状態</w:t>
-            </w:r>
-          </w:p>
-        </w:tc>
-        <w:tc>
-          <w:tcPr>
-            <w:tcW w:type="dxa" w:w="2494"/>
-            <w:shd w:val="clear" w:color="auto" w:fill="1F3864"/>
-          </w:tcPr>
-          <w:p>
-            <w:pPr>
-              <w:spacing w:after="0" w:line="240" w:lineRule="auto"/>
-            </w:pPr>
-            <w:r/>
-            <w:r>
-              <w:rPr>
-                <w:b/>
-                <w:color w:val="FFFFFF"/>
-                <w:sz w:val="17"/>
-              </w:rPr>
-              <w:t>残る発信</w:t>
-            </w:r>
-          </w:p>
-        </w:tc>
-      </w:tr>
-      <w:tr>
-        <w:tc>
-          <w:tcPr>
-            <w:tcW w:type="dxa" w:w="1814"/>
-          </w:tcPr>
-          <w:p>
-            <w:pPr>
-              <w:spacing w:after="0" w:line="240" w:lineRule="auto"/>
-            </w:pPr>
-            <w:r/>
-            <w:r>
-              <w:rPr>
-                <w:b w:val="0"/>
-                <w:sz w:val="17"/>
-              </w:rPr>
-              <w:t>Sylvia（会場スレッド）</w:t>
-            </w:r>
-          </w:p>
-        </w:tc>
-        <w:tc>
-          <w:tcPr>
-            <w:tcW w:type="dxa" w:w="3628"/>
-          </w:tcPr>
-          <w:p>
-            <w:pPr>
-              <w:spacing w:after="0" w:line="240" w:lineRule="auto"/>
-            </w:pPr>
-            <w:r/>
-            <w:r>
-              <w:rPr>
-                <w:b w:val="0"/>
-                <w:sz w:val="17"/>
-              </w:rPr>
-              <w:t>座席案（U28）＋機材リスト＋9/22 回答への返答、スケッチ添付</w:t>
-            </w:r>
-          </w:p>
-        </w:tc>
-        <w:tc>
-          <w:tcPr>
-            <w:tcW w:type="dxa" w:w="1928"/>
-          </w:tcPr>
-          <w:p>
-            <w:pPr>
-              <w:spacing w:after="0" w:line="240" w:lineRule="auto"/>
-            </w:pPr>
-            <w:r/>
-            <w:r>
-              <w:rPr>
-                <w:b w:val="0"/>
-                <w:sz w:val="17"/>
-              </w:rPr>
-              <w:t>9/24 09:43 送信済み</w:t>
-            </w:r>
-          </w:p>
-        </w:tc>
-        <w:tc>
-          <w:tcPr>
-            <w:tcW w:type="dxa" w:w="2494"/>
-          </w:tcPr>
-          <w:p>
-            <w:pPr>
-              <w:spacing w:after="0" w:line="240" w:lineRule="auto"/>
-            </w:pPr>
-            <w:r/>
-            <w:r>
-              <w:rPr>
-                <w:b w:val="0"/>
-                <w:sz w:val="17"/>
-              </w:rPr>
-              <w:t>Sirada 氏訂正は別途</w:t>
-            </w:r>
-          </w:p>
-        </w:tc>
-      </w:tr>
-      <w:tr>
-        <w:tc>
-          <w:tcPr>
-            <w:tcW w:type="dxa" w:w="1814"/>
-          </w:tcPr>
-          <w:p>
-            <w:pPr>
-              <w:spacing w:after="0" w:line="240" w:lineRule="auto"/>
-            </w:pPr>
-            <w:r/>
-            <w:r>
-              <w:rPr>
-                <w:b w:val="0"/>
-                <w:sz w:val="17"/>
-              </w:rPr>
-              <w:t>Sylvia（バナー）</w:t>
-            </w:r>
-          </w:p>
-        </w:tc>
-        <w:tc>
-          <w:tcPr>
-            <w:tcW w:type="dxa" w:w="3628"/>
-          </w:tcPr>
-          <w:p>
-            <w:pPr>
-              <w:spacing w:after="0" w:line="240" w:lineRule="auto"/>
-            </w:pPr>
-            <w:r/>
-            <w:r>
-              <w:rPr>
-                <w:b w:val="0"/>
-                <w:sz w:val="17"/>
-              </w:rPr>
-              <w:t>修正版デザインの承認、ソフトコピー投影と物理バナーの併用に同意</w:t>
-            </w:r>
-          </w:p>
-        </w:tc>
-        <w:tc>
-          <w:tcPr>
-            <w:tcW w:type="dxa" w:w="1928"/>
-          </w:tcPr>
-          <w:p>
-            <w:pPr>
-              <w:spacing w:after="0" w:line="240" w:lineRule="auto"/>
-            </w:pPr>
-            <w:r/>
-            <w:r>
-              <w:rPr>
-                <w:b w:val="0"/>
-                <w:sz w:val="17"/>
-              </w:rPr>
-              <w:t>下書き作成済み（未送信）</w:t>
-            </w:r>
-          </w:p>
-        </w:tc>
-        <w:tc>
-          <w:tcPr>
-            <w:tcW w:type="dxa" w:w="2494"/>
-          </w:tcPr>
-          <w:p>
-            <w:pPr>
-              <w:spacing w:after="0" w:line="240" w:lineRule="auto"/>
-            </w:pPr>
-            <w:r/>
-            <w:r>
-              <w:rPr>
-                <w:b w:val="0"/>
-                <w:sz w:val="17"/>
-              </w:rPr>
-              <w:t>送信</w:t>
-            </w:r>
-          </w:p>
-        </w:tc>
-      </w:tr>
-      <w:tr>
-        <w:tc>
-          <w:tcPr>
-            <w:tcW w:type="dxa" w:w="1814"/>
-          </w:tcPr>
-          <w:p>
-            <w:pPr>
-              <w:spacing w:after="0" w:line="240" w:lineRule="auto"/>
-            </w:pPr>
-            <w:r/>
-            <w:r>
-              <w:rPr>
-                <w:b w:val="0"/>
-                <w:sz w:val="17"/>
-              </w:rPr>
-              <w:t>池田・Mizan</w:t>
-            </w:r>
-          </w:p>
-        </w:tc>
-        <w:tc>
-          <w:tcPr>
-            <w:tcW w:type="dxa" w:w="3628"/>
-          </w:tcPr>
-          <w:p>
-            <w:pPr>
-              <w:spacing w:after="0" w:line="240" w:lineRule="auto"/>
-            </w:pPr>
-            <w:r/>
-            <w:r>
-              <w:rPr>
-                <w:b w:val="0"/>
-                <w:sz w:val="17"/>
-              </w:rPr>
-              <w:t>招待状 v2 の送付と質疑時間・CN 追記の確認</w:t>
-            </w:r>
-          </w:p>
-        </w:tc>
-        <w:tc>
-          <w:tcPr>
-            <w:tcW w:type="dxa" w:w="1928"/>
-          </w:tcPr>
-          <w:p>
-            <w:pPr>
-              <w:spacing w:after="0" w:line="240" w:lineRule="auto"/>
-            </w:pPr>
-            <w:r/>
-            <w:r>
-              <w:rPr>
-                <w:b w:val="0"/>
-                <w:sz w:val="17"/>
-              </w:rPr>
-              <w:t>9/24 08:56 送信、10:00 池田回答、10:34 返信済み</w:t>
-            </w:r>
-          </w:p>
-        </w:tc>
-        <w:tc>
-          <w:tcPr>
-            <w:tcW w:type="dxa" w:w="2494"/>
-          </w:tcPr>
-          <w:p>
-            <w:pPr>
-              <w:spacing w:after="0" w:line="240" w:lineRule="auto"/>
-            </w:pPr>
-            <w:r/>
-            <w:r>
-              <w:rPr>
-                <w:b w:val="0"/>
-                <w:sz w:val="17"/>
-              </w:rPr>
-              <w:t>なし。藤本にも最新レター（v2）を転送済み（12:51）</w:t>
-            </w:r>
-          </w:p>
-        </w:tc>
-      </w:tr>
-      <w:tr>
-        <w:tc>
-          <w:tcPr>
-            <w:tcW w:type="dxa" w:w="1814"/>
-          </w:tcPr>
-          <w:p>
-            <w:pPr>
-              <w:spacing w:after="0" w:line="240" w:lineRule="auto"/>
-            </w:pPr>
-            <w:r/>
-            <w:r>
-              <w:rPr>
-                <w:b w:val="0"/>
-                <w:sz w:val="17"/>
-              </w:rPr>
-              <w:t>田中</w:t>
-            </w:r>
-          </w:p>
-        </w:tc>
-        <w:tc>
-          <w:tcPr>
-            <w:tcW w:type="dxa" w:w="3628"/>
-          </w:tcPr>
-          <w:p>
-            <w:pPr>
-              <w:spacing w:after="0" w:line="240" w:lineRule="auto"/>
-            </w:pPr>
-            <w:r/>
-            <w:r>
-              <w:rPr>
-                <w:b w:val="0"/>
-                <w:sz w:val="17"/>
-              </w:rPr>
-              <w:t>ウズベキスタンのビザ要への返信</w:t>
-            </w:r>
-          </w:p>
-        </w:tc>
-        <w:tc>
-          <w:tcPr>
-            <w:tcW w:type="dxa" w:w="1928"/>
-          </w:tcPr>
-          <w:p>
-            <w:pPr>
-              <w:spacing w:after="0" w:line="240" w:lineRule="auto"/>
-            </w:pPr>
-            <w:r/>
-            <w:r>
-              <w:rPr>
-                <w:b w:val="0"/>
-                <w:sz w:val="17"/>
-              </w:rPr>
-              <w:t>9/24 08:58 送信済み</w:t>
-            </w:r>
-          </w:p>
-        </w:tc>
-        <w:tc>
-          <w:tcPr>
-            <w:tcW w:type="dxa" w:w="2494"/>
-          </w:tcPr>
-          <w:p>
-            <w:pPr>
-              <w:spacing w:after="0" w:line="240" w:lineRule="auto"/>
-            </w:pPr>
-            <w:r/>
-            <w:r>
-              <w:rPr>
-                <w:b w:val="0"/>
-                <w:sz w:val="17"/>
-              </w:rPr>
-              <w:t>COSEM 手順の Letter of undertaking（COSEM 作成・本人署名）は未共有。一行で共有</w:t>
-            </w:r>
-          </w:p>
-        </w:tc>
-      </w:tr>
-      <w:tr>
-        <w:tc>
-          <w:tcPr>
-            <w:tcW w:type="dxa" w:w="1814"/>
-          </w:tcPr>
-          <w:p>
-            <w:pPr>
-              <w:spacing w:after="0" w:line="240" w:lineRule="auto"/>
-            </w:pPr>
-            <w:r/>
-            <w:r>
-              <w:rPr>
-                <w:b w:val="0"/>
-                <w:sz w:val="17"/>
-              </w:rPr>
-              <w:t>Sylvia（WhatsApp）</w:t>
-            </w:r>
-          </w:p>
-        </w:tc>
-        <w:tc>
-          <w:tcPr>
-            <w:tcW w:type="dxa" w:w="3628"/>
-          </w:tcPr>
-          <w:p>
-            <w:pPr>
-              <w:spacing w:after="0" w:line="240" w:lineRule="auto"/>
-            </w:pPr>
-            <w:r/>
-            <w:r>
-              <w:rPr>
-                <w:b w:val="0"/>
-                <w:sz w:val="17"/>
-              </w:rPr>
-              <w:t>名札・マイクの範囲、バナー修正依頼</w:t>
-            </w:r>
-          </w:p>
-        </w:tc>
-        <w:tc>
-          <w:tcPr>
-            <w:tcW w:type="dxa" w:w="1928"/>
-          </w:tcPr>
-          <w:p>
-            <w:pPr>
-              <w:spacing w:after="0" w:line="240" w:lineRule="auto"/>
-            </w:pPr>
-            <w:r/>
-            <w:r>
-              <w:rPr>
-                <w:b w:val="0"/>
-                <w:sz w:val="17"/>
-              </w:rPr>
-              <w:t>9/24 返信済み</w:t>
-            </w:r>
-          </w:p>
-        </w:tc>
-        <w:tc>
-          <w:tcPr>
-            <w:tcW w:type="dxa" w:w="2494"/>
-          </w:tcPr>
-          <w:p>
-            <w:pPr>
-              <w:spacing w:after="0" w:line="240" w:lineRule="auto"/>
-            </w:pPr>
-            <w:r/>
-            <w:r>
-              <w:rPr>
-                <w:b w:val="0"/>
-                <w:sz w:val="17"/>
-              </w:rPr>
-              <w:t>なし</w:t>
-            </w:r>
-          </w:p>
-        </w:tc>
-      </w:tr>
-    </w:tbl>
-    <w:p>
-      <w:pPr>
-        <w:spacing w:after="40"/>
-      </w:pPr>
-    </w:p>
-    <w:p>
-      <w:pPr>
-        <w:spacing w:before="200" w:after="80"/>
-        <w:pBdr>
-          <w:bottom w:val="single" w:sz="6" w:space="1" w:color="1F3864"/>
-        </w:pBdr>
-      </w:pPr>
-      <w:r>
-        <w:rPr>
-          <w:b/>
-          <w:i w:val="0"/>
-          <w:color w:val="1F3864"/>
-          <w:sz w:val="24"/>
-        </w:rPr>
-        <w:t>6. 9/25 内閣府連絡会で扱う事項（案）</w:t>
+        <w:t>6. 本日 16:30 内閣府連絡会で確認する事項</w:t>
       </w:r>
     </w:p>
     <w:p>
@@ -4063,7 +3176,7 @@
         <w:rPr>
           <w:sz w:val="19"/>
         </w:rPr>
-        <w:t>・テクニカルセッションの内閣府登壇者（6枠目）の指名依頼。持ち時間15分、10/2 にタイトル・アブストラクト、10/20 にスライド。</w:t>
+        <w:t>・出番の確認: 公邸レセプション挨拶＝林統括官、Joint Opening 挨拶＝林統括官、RT 発表＝林統括官（民間2社と。仙台市の APMCDRR 紹介と重複しないように）、TS＝内閣府担当者（氏名要確認）、Gala＝挨拶枠なしのため出席を検討中。林統括官は3時間のみ滞在との情報あり。</w:t>
       </w:r>
     </w:p>
     <w:p>
@@ -4075,7 +3188,7 @@
         <w:rPr>
           <w:sz w:val="19"/>
         </w:rPr>
-        <w:t>・日本パビリオン開会式（GOH ツアー内）の所要時間の希望。これにより Day 1 全体の前倒し可否を判断し、COSEM へ回答する。</w:t>
+        <w:t>・TS の民間2社の人選と時期。招待状は COSEM 署名が必要なので確定次第すぐ発出。</w:t>
       </w:r>
     </w:p>
     <w:p>
@@ -4087,7 +3200,7 @@
         <w:rPr>
           <w:sz w:val="19"/>
         </w:rPr>
-        <w:t>・SJ60 記念レセプション（10/27）: シンガポール GOH への招待は大使館から MHA へ（9/16 送付済み）。Comr の登場は乾杯または写真撮影時の紹介。名簿は 9/27 頃提出。</w:t>
+        <w:t>・宿泊: Dorsett 2室キープ。追加の要否。</w:t>
       </w:r>
     </w:p>
     <w:p>
@@ -4099,7 +3212,7 @@
         <w:rPr>
           <w:sz w:val="19"/>
         </w:rPr>
-        <w:t>・ガラディナー（10/28）での日本政府代表挨拶は COSEM 側で枠を設けられない（Leow 氏 9/15、内閣府へ通知済み）。</w:t>
+        <w:t>・日本パビリオンの所要時間と内容（Sylvia 氏からの質問）。ADRC 参加者の同席を求めるか。</w:t>
       </w:r>
     </w:p>
     <w:p>
@@ -4111,7 +3224,7 @@
         <w:rPr>
           <w:sz w:val="19"/>
         </w:rPr>
-        <w:t>・SC 用 ADRC 活動報告案は研究部の修正を反映済み（9/25 午前締切）。SC 事務（議案・進行・会計報告）は藤中。</w:t>
+        <w:t>・Day 1 の RT 分割案（RT(1) 13:00-15:00、SC 15:15-16:15、RT(2) 29日 09:00）の了承。</w:t>
       </w:r>
     </w:p>
     <w:p>
@@ -4123,7 +3236,7 @@
         <w:rPr>
           <w:sz w:val="19"/>
         </w:rPr>
-        <w:t>・仙台市副市長（次期 APMCDRR ホスト）の随行者の扱い（Sylvia 氏持ち帰り中）。</w:t>
+        <w:t>・林統括官への挨拶回りを再来週目途で調整（宮木）。ロジ確定前に一度打合せ。</w:t>
       </w:r>
     </w:p>
     <w:p>
@@ -4142,7 +3255,7 @@
           <w:color w:val="595959"/>
           <w:sz w:val="16"/>
         </w:rPr>
-        <w:t>注: 本資料の「提案」欄は荒木田の判断であり、決定事項ではない。数値・日付はすべて出典に当たって確認済み。</w:t>
+        <w:t>注: 「決定・方針」は 9/25 所内打合せの合意。COSEM・内閣府との調整で変わりうる。Plaud の要約にある「10月29日」は 9/29 の誤りとして扱った。</w:t>
       </w:r>
     </w:p>
     <w:sectPr>

</xml_diff>